<commit_message>
Adiciona .gitignore para arquivos temporários
</commit_message>
<xml_diff>
--- a/TCC/Memorial.docx
+++ b/TCC/Memorial.docx
@@ -86,7 +86,7 @@
           </mc:Choice>
           <mc:Fallback>
             <w:pict>
-              <v:rect w14:anchorId="5D0ED12C" id="Rectangle 18" o:spid="_x0000_s1026" style="position:absolute;margin-left:0;margin-top:-85.05pt;width:601.8pt;height:885.9pt;z-index:-251657216;visibility:visible;mso-wrap-style:square;mso-width-percent:0;mso-height-percent:0;mso-wrap-distance-left:9pt;mso-wrap-distance-top:0;mso-wrap-distance-right:9pt;mso-wrap-distance-bottom:0;mso-position-horizontal:left;mso-position-horizontal-relative:page;mso-position-vertical:absolute;mso-position-vertical-relative:text;mso-width-percent:0;mso-height-percent:0;mso-width-relative:margin;mso-height-relative:margin;v-text-anchor:top" o:gfxdata="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" fillcolor="#15222d" strokecolor="#203644">
+              <v:rect w14:anchorId="270965B8" id="Rectangle 18" o:spid="_x0000_s1026" style="position:absolute;margin-left:0;margin-top:-85.05pt;width:601.8pt;height:885.9pt;z-index:-251657216;visibility:visible;mso-wrap-style:square;mso-width-percent:0;mso-height-percent:0;mso-wrap-distance-left:9pt;mso-wrap-distance-top:0;mso-wrap-distance-right:9pt;mso-wrap-distance-bottom:0;mso-position-horizontal:left;mso-position-horizontal-relative:page;mso-position-vertical:absolute;mso-position-vertical-relative:text;mso-width-percent:0;mso-height-percent:0;mso-width-relative:margin;mso-height-relative:margin;v-text-anchor:top" o:gfxdata="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" fillcolor="#15222d" strokecolor="#203644">
                 <w10:wrap anchorx="page"/>
               </v:rect>
             </w:pict>
@@ -315,7 +315,7 @@
           <w:sz w:val="24"/>
           <w:szCs w:val="24"/>
         </w:rPr>
-        <w:t>NOME DO ALUNO</w:t>
+        <w:t>HÉLIO MARCOS MENEZES DE LIMA</w:t>
       </w:r>
     </w:p>
     <w:p>
@@ -627,7 +627,7 @@
           </mc:Choice>
           <mc:Fallback>
             <w:pict>
-              <v:group w14:anchorId="27DE4281" id="Agrupar 62" o:spid="_x0000_s1026" style="width:228pt;height:30.5pt;mso-position-horizontal-relative:char;mso-position-vertical-relative:line" coordsize="28956,3873" o:gfxdata="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">
+              <v:group w14:anchorId="64EDE92E" id="Agrupar 62" o:spid="_x0000_s1026" style="width:228pt;height:30.5pt;mso-position-horizontal-relative:char;mso-position-vertical-relative:line" coordsize="28956,3873" o:gfxdata="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">
                 <v:shapetype id="_x0000_t75" coordsize="21600,21600" o:spt="75" o:preferrelative="t" path="m@4@5l@4@11@9@11@9@5xe" filled="f" stroked="f">
                   <v:stroke joinstyle="miter"/>
                   <v:formulas>
@@ -717,6 +717,14 @@
               <w:color w:val="2F5496" w:themeColor="accent1" w:themeShade="BF"/>
               <w:sz w:val="24"/>
               <w:szCs w:val="24"/>
+              <w14:textFill>
+                <w14:solidFill>
+                  <w14:schemeClr w14:val="accent1">
+                    <w14:lumMod w14:val="75000"/>
+                    <w14:lumMod w14:val="75000"/>
+                  </w14:schemeClr>
+                </w14:solidFill>
+              </w14:textFill>
             </w:rPr>
           </w:pPr>
         </w:p>
@@ -2617,12 +2625,7 @@
           <w:szCs w:val="24"/>
         </w:rPr>
         <w:sectPr>
-          <w:headerReference w:type="even" r:id="rId12"/>
-          <w:headerReference w:type="default" r:id="rId13"/>
-          <w:footerReference w:type="even" r:id="rId14"/>
-          <w:footerReference w:type="default" r:id="rId15"/>
-          <w:headerReference w:type="first" r:id="rId16"/>
-          <w:footerReference w:type="first" r:id="rId17"/>
+          <w:footerReference w:type="default" r:id="rId12"/>
           <w:pgSz w:w="11906" w:h="16838"/>
           <w:pgMar w:top="1701" w:right="1134" w:bottom="1134" w:left="1701" w:header="709" w:footer="709" w:gutter="0"/>
           <w:cols w:space="708"/>
@@ -2722,7 +2725,7 @@
           </mc:Choice>
           <mc:Fallback>
             <w:pict>
-              <v:line w14:anchorId="46D259E3" id="Line 2" o:spid="_x0000_s1026" style="visibility:visible;mso-wrap-style:square;mso-left-percent:-10001;mso-top-percent:-10001;mso-position-horizontal:absolute;mso-position-horizontal-relative:char;mso-position-vertical:absolute;mso-position-vertical-relative:line;mso-left-percent:-10001;mso-top-percent:-10001" from="0,0" to="108.7pt,0" o:gfxdata="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" strokecolor="#e5cc80" strokeweight="2.25pt">
+              <v:line w14:anchorId="2E0C7FD4" id="Line 2" o:spid="_x0000_s1026" style="visibility:visible;mso-wrap-style:square;mso-left-percent:-10001;mso-top-percent:-10001;mso-position-horizontal:absolute;mso-position-horizontal-relative:char;mso-position-vertical:absolute;mso-position-vertical-relative:line;mso-left-percent:-10001;mso-top-percent:-10001" from="0,0" to="108.7pt,0" o:gfxdata="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" strokecolor="#e5cc80" strokeweight="2.25pt">
                 <w10:anchorlock/>
               </v:line>
             </w:pict>
@@ -2980,64 +2983,75 @@
         <w:t xml:space="preserve">Nesse contexto, vislumbro que uma ferramenta digital que aproxime o cidadão dos gestores da Prefeitura pode ser transformadora. É com essa premissa que meu projeto de TCC se alinha: a implementação de um </w:t>
       </w:r>
       <w:r>
+        <w:t>s</w:t>
+      </w:r>
+      <w:r>
+        <w:t xml:space="preserve">istema </w:t>
+      </w:r>
+      <w:r>
+        <w:t>onde o cidadão pode registrar um problema ou ocorrência de forma simplificada</w:t>
+      </w:r>
+      <w:r>
+        <w:t xml:space="preserve">, o Requerimento do Cidadão – </w:t>
+      </w:r>
+      <w:proofErr w:type="spellStart"/>
+      <w:r>
+        <w:t>ReqCidadão</w:t>
+      </w:r>
+      <w:proofErr w:type="spellEnd"/>
+      <w:r>
+        <w:t>. Em contrapartida, um gestor público de uma esfera determinada (municipal, estadual ou até federal) poderia atuar e responder sobre essa questão, oferecendo uma solução ou um plano de ação claro e transparente. Este sistema não só democratiza o acesso à comunicação com o poder público, como também fornece à gestão uma rica base de dados para entender as necessidades da população e direcionar esforços de forma mais estratégica, pavimentando o caminho para futuras otimizações baseadas em análise de dados e, quem sabe, inteligência artificial.</w:t>
+      </w:r>
+    </w:p>
+    <w:p>
+      <w:pPr>
+        <w:pStyle w:val="CorpodoTexto"/>
+      </w:pPr>
+    </w:p>
+    <w:p>
+      <w:pPr>
+        <w:pStyle w:val="Ttulo2"/>
         <w:rPr>
           <w:highlight w:val="yellow"/>
         </w:rPr>
-        <w:t>Sistema Colaborativo</w:t>
-      </w:r>
-      <w:r>
-        <w:t xml:space="preserve"> onde o cidadão pode registrar um problema ou ocorrência de forma simplificada. Em contrapartida, um gestor público de uma esfera determinada (municipal, estadual ou até federal) poderia atuar e responder sobre essa questão, oferecendo uma solução ou um plano de ação claro e transparente. Este sistema não só democratiza o acesso à comunicação com o poder público, como também fornece à gestão uma rica base de dados para entender as necessidades da população e direcionar esforços de forma mais estratégica, pavimentando o caminho para futuras otimizações baseadas em análise de dados e, quem sabe, inteligência artificial.</w:t>
-      </w:r>
-    </w:p>
-    <w:p>
-      <w:pPr>
-        <w:pStyle w:val="CorpodoTexto"/>
-      </w:pPr>
-    </w:p>
-    <w:p>
-      <w:pPr>
-        <w:pStyle w:val="Ttulo2"/>
+      </w:pPr>
+      <w:bookmarkStart w:id="5" w:name="_Toc222648854"/>
+      <w:r>
         <w:rPr>
           <w:highlight w:val="yellow"/>
         </w:rPr>
-      </w:pPr>
-      <w:bookmarkStart w:id="5" w:name="_Toc222648854"/>
-      <w:r>
+        <w:t>Título Secundário</w:t>
+      </w:r>
+      <w:bookmarkEnd w:id="5"/>
+    </w:p>
+    <w:p>
+      <w:pPr>
+        <w:pStyle w:val="Ttulo3"/>
         <w:rPr>
           <w:highlight w:val="yellow"/>
         </w:rPr>
-        <w:t>Título Secundário</w:t>
-      </w:r>
-      <w:bookmarkEnd w:id="5"/>
-    </w:p>
-    <w:p>
-      <w:pPr>
-        <w:pStyle w:val="Ttulo3"/>
+      </w:pPr>
+      <w:bookmarkStart w:id="6" w:name="_Toc222648855"/>
+      <w:r>
         <w:rPr>
           <w:highlight w:val="yellow"/>
         </w:rPr>
-      </w:pPr>
-      <w:bookmarkStart w:id="6" w:name="_Toc222648855"/>
-      <w:r>
+        <w:t>Título Terciário</w:t>
+      </w:r>
+      <w:bookmarkEnd w:id="6"/>
+    </w:p>
+    <w:p>
+      <w:pPr>
+        <w:pStyle w:val="Ttulo4"/>
         <w:rPr>
           <w:highlight w:val="yellow"/>
         </w:rPr>
-        <w:t>Título Terciário</w:t>
-      </w:r>
-      <w:bookmarkEnd w:id="6"/>
-    </w:p>
-    <w:p>
-      <w:pPr>
-        <w:pStyle w:val="Ttulo4"/>
+      </w:pPr>
+      <w:bookmarkStart w:id="7" w:name="_Toc222648856"/>
+      <w:r>
         <w:rPr>
           <w:highlight w:val="yellow"/>
         </w:rPr>
-      </w:pPr>
-      <w:bookmarkStart w:id="7" w:name="_Toc222648856"/>
-      <w:r>
-        <w:rPr>
-          <w:highlight w:val="yellow"/>
-        </w:rPr>
         <w:t>Título Quaternário</w:t>
       </w:r>
       <w:bookmarkEnd w:id="7"/>
@@ -3056,8 +3070,8 @@
       <w:pPr>
         <w:pStyle w:val="CorpodoTexto"/>
         <w:sectPr>
-          <w:headerReference w:type="default" r:id="rId18"/>
-          <w:footerReference w:type="default" r:id="rId19"/>
+          <w:headerReference w:type="default" r:id="rId13"/>
+          <w:footerReference w:type="default" r:id="rId14"/>
           <w:pgSz w:w="11906" w:h="16838"/>
           <w:pgMar w:top="1701" w:right="1134" w:bottom="1134" w:left="1701" w:header="1134" w:footer="709" w:gutter="0"/>
           <w:pgNumType w:start="3"/>
@@ -3153,7 +3167,7 @@
           </mc:Choice>
           <mc:Fallback>
             <w:pict>
-              <v:line w14:anchorId="39527D8B" id="Line 2" o:spid="_x0000_s1026" style="visibility:visible;mso-wrap-style:square;mso-left-percent:-10001;mso-top-percent:-10001;mso-position-horizontal:absolute;mso-position-horizontal-relative:char;mso-position-vertical:absolute;mso-position-vertical-relative:line;mso-left-percent:-10001;mso-top-percent:-10001" from="0,0" to="108.7pt,0" o:gfxdata="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" strokecolor="#e5cc80" strokeweight="2.25pt">
+              <v:line w14:anchorId="55B3F8DA" id="Line 2" o:spid="_x0000_s1026" style="visibility:visible;mso-wrap-style:square;mso-left-percent:-10001;mso-top-percent:-10001;mso-position-horizontal:absolute;mso-position-horizontal-relative:char;mso-position-vertical:absolute;mso-position-vertical-relative:line;mso-left-percent:-10001;mso-top-percent:-10001" from="0,0" to="108.7pt,0" o:gfxdata="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" strokecolor="#e5cc80" strokeweight="2.25pt">
                 <w10:anchorlock/>
               </v:line>
             </w:pict>
@@ -3249,7 +3263,15 @@
         <w:pStyle w:val="CorpodoTexto"/>
       </w:pPr>
       <w:r>
-        <w:t xml:space="preserve">E, claro, com um significado especial, temos o projeto que resume toda essa formação: o Sistema Colaborativo Cidadão-Governo, cujo repositório está em </w:t>
+        <w:t xml:space="preserve">E, claro, com um significado especial, temos o projeto que resume toda essa formação: o </w:t>
+      </w:r>
+      <w:proofErr w:type="spellStart"/>
+      <w:r>
+        <w:t>ReqCidadão</w:t>
+      </w:r>
+      <w:proofErr w:type="spellEnd"/>
+      <w:r>
+        <w:t xml:space="preserve">, cujo repositório está em </w:t>
       </w:r>
       <w:r>
         <w:t>https://github.com/heliomlima/RequerimentosCidadao</w:t>
@@ -3412,7 +3434,7 @@
           </mc:Choice>
           <mc:Fallback>
             <w:pict>
-              <v:line w14:anchorId="4FC6F0AA" id="Line 2" o:spid="_x0000_s1026" style="visibility:visible;mso-wrap-style:square;mso-left-percent:-10001;mso-top-percent:-10001;mso-position-horizontal:absolute;mso-position-horizontal-relative:char;mso-position-vertical:absolute;mso-position-vertical-relative:line;mso-left-percent:-10001;mso-top-percent:-10001" from="0,0" to="108.7pt,0" o:gfxdata="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" strokecolor="#e5cc80" strokeweight="2.25pt">
+              <v:line w14:anchorId="22A3FB3C" id="Line 2" o:spid="_x0000_s1026" style="visibility:visible;mso-wrap-style:square;mso-left-percent:-10001;mso-top-percent:-10001;mso-position-horizontal:absolute;mso-position-horizontal-relative:char;mso-position-vertical:absolute;mso-position-vertical-relative:line;mso-left-percent:-10001;mso-top-percent:-10001" from="0,0" to="108.7pt,0" o:gfxdata="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" strokecolor="#e5cc80" strokeweight="2.25pt">
                 <w10:anchorlock/>
               </v:line>
             </w:pict>
@@ -3438,7 +3460,15 @@
         <w:pStyle w:val="CorpodoTexto"/>
       </w:pPr>
       <w:r>
-        <w:t xml:space="preserve">A construção de uma solução completa como o Sistema Colaborativo Cidadão-Governo exige a seleção cuidadosa de tecnologias e ferramentas que garantam robustez, escalabilidade, segurança e uma excelente experiência de usuário. Para atender a esses requisitos, optou-se por uma </w:t>
+        <w:t xml:space="preserve">A construção de uma solução completa como o </w:t>
+      </w:r>
+      <w:proofErr w:type="spellStart"/>
+      <w:r>
+        <w:t>ReqCidadão</w:t>
+      </w:r>
+      <w:proofErr w:type="spellEnd"/>
+      <w:r>
+        <w:t xml:space="preserve"> exige a seleção cuidadosa de tecnologias e ferramentas que garantam robustez, escalabilidade, segurança e uma excelente experiência de usuário. Para atender a esses requisitos, optou-se por uma </w:t>
       </w:r>
       <w:proofErr w:type="spellStart"/>
       <w:r>
@@ -3618,16 +3648,7 @@
       </w:r>
       <w:proofErr w:type="spellEnd"/>
       <w:r>
-        <w:t xml:space="preserve"> desenvolvida pelo Facebook, foi escolhida por sua abordagem baseada em componentes, que promove a modularidade, reutilização de código e facilita a manutenção de interfaces complexas </w:t>
-      </w:r>
-      <w:r>
-        <w:rPr>
-          <w:highlight w:val="yellow"/>
-        </w:rPr>
-        <w:t>(FACEBOOK, [s.d.])</w:t>
-      </w:r>
-      <w:r>
-        <w:t xml:space="preserve">. Sua natureza declarativa simplifica o desenvolvimento de </w:t>
+        <w:t xml:space="preserve"> desenvolvida pelo Facebook, foi escolhida por sua abordagem baseada em componentes, que promove a modularidade, reutilização de código e facilita a manutenção de interfaces complexas. Sua natureza declarativa simplifica o desenvolvimento de </w:t>
       </w:r>
       <w:proofErr w:type="spellStart"/>
       <w:r>
@@ -3638,10 +3659,19 @@
         <w:t xml:space="preserve"> interativas e eficientes, enquanto o conceito de Virtual DOM otimiza a atualização da interface, resultando em uma experiência de usuário fluida e responsiva </w:t>
       </w:r>
       <w:r>
-        <w:rPr>
-          <w:highlight w:val="yellow"/>
-        </w:rPr>
-        <w:t>(ABRAMOV; HACKWORT, 2016)</w:t>
+        <w:t>(</w:t>
+      </w:r>
+      <w:r>
+        <w:t>PORTO</w:t>
+      </w:r>
+      <w:r>
+        <w:t>, 20</w:t>
+      </w:r>
+      <w:r>
+        <w:t>24</w:t>
+      </w:r>
+      <w:r>
+        <w:t>)</w:t>
       </w:r>
       <w:r>
         <w:t xml:space="preserve">. Além disso, a vasta comunidade e o ecossistema maduro do </w:t>
@@ -3668,48 +3698,35 @@
       <w:r>
         <w:t xml:space="preserve">Aplicação: No </w:t>
       </w:r>
-      <w:r>
-        <w:rPr>
-          <w:highlight w:val="yellow"/>
-        </w:rPr>
-        <w:t>Sistema Colaborativo Cidadão-Governo</w:t>
-      </w:r>
+      <w:proofErr w:type="spellStart"/>
+      <w:r>
+        <w:t>ReqCidadão</w:t>
+      </w:r>
+      <w:proofErr w:type="spellEnd"/>
       <w:r>
         <w:t xml:space="preserve">, o </w:t>
       </w:r>
       <w:r>
-        <w:rPr>
-          <w:i/>
-          <w:iCs/>
-        </w:rPr>
         <w:t>React.js</w:t>
       </w:r>
       <w:r>
         <w:t xml:space="preserve"> é empregado na construção de todas as interfaces do usuário, desde as telas de </w:t>
       </w:r>
       <w:r>
-        <w:rPr>
-          <w:i/>
-          <w:iCs/>
-        </w:rPr>
         <w:t>login</w:t>
       </w:r>
       <w:r>
         <w:t xml:space="preserve"> e cadastro até os </w:t>
       </w:r>
       <w:r>
-        <w:rPr>
-          <w:i/>
-          <w:iCs/>
-        </w:rPr>
         <w:t>dashboards</w:t>
       </w:r>
       <w:r>
-        <w:t xml:space="preserve"> de visualização e </w:t>
+        <w:t xml:space="preserve"> de visualização e gerenciamento de ocorrências para cidadãos e gestores. A arquitetura de componentes permitiu criar </w:t>
       </w:r>
       <w:r>
         <w:lastRenderedPageBreak/>
-        <w:t>gerenciamento de ocorrências para cidadãos e gestores. A arquitetura de componentes permitiu criar elementos reutilizáveis para formulários de registro de ocorrências, listas de notificações, e painéis de controle, garantindo consistência visual e funcional em toda a aplicação.</w:t>
+        <w:t>elementos reutilizáveis para formulários de registro de ocorrências, listas de notificações, e painéis de controle, garantindo consistência visual e funcional em toda a aplicação.</w:t>
       </w:r>
     </w:p>
     <w:p>
@@ -3747,28 +3764,23 @@
       </w:r>
       <w:proofErr w:type="spellStart"/>
       <w:r>
+        <w:t>Tailwind</w:t>
+      </w:r>
+      <w:proofErr w:type="spellEnd"/>
+      <w:r>
         <w:rPr>
           <w:i/>
           <w:iCs/>
         </w:rPr>
-        <w:t>Tailwind</w:t>
-      </w:r>
-      <w:proofErr w:type="spellEnd"/>
-      <w:r>
-        <w:rPr>
-          <w:i/>
-          <w:iCs/>
-        </w:rPr>
-        <w:t xml:space="preserve"> CSS</w:t>
+        <w:t xml:space="preserve"> </w:t>
+      </w:r>
+      <w:r>
+        <w:t>CSS</w:t>
       </w:r>
       <w:r>
         <w:t xml:space="preserve"> é um </w:t>
       </w:r>
       <w:r>
-        <w:rPr>
-          <w:i/>
-          <w:iCs/>
-        </w:rPr>
         <w:t>framework</w:t>
       </w:r>
       <w:r>
@@ -3776,73 +3788,47 @@
       </w:r>
       <w:proofErr w:type="spellStart"/>
       <w:r>
-        <w:rPr>
-          <w:i/>
-          <w:iCs/>
-        </w:rPr>
         <w:t>utility-first</w:t>
       </w:r>
       <w:proofErr w:type="spellEnd"/>
       <w:r>
-        <w:t xml:space="preserve">, o que significa que ele oferece uma vasta gama de classes utilitárias de baixo nível diretamente no HTML/JSX para estilizar elementos </w:t>
-      </w:r>
-      <w:r>
-        <w:rPr>
-          <w:highlight w:val="yellow"/>
-        </w:rPr>
-        <w:t>(TAILWIND LABS, [s.d.])</w:t>
-      </w:r>
-      <w:r>
-        <w:t xml:space="preserve">. Essa abordagem acelera significativamente o processo de </w:t>
-      </w:r>
-      <w:r>
-        <w:rPr>
-          <w:i/>
-          <w:iCs/>
-        </w:rPr>
+        <w:t xml:space="preserve">, o que significa que ele oferece uma vasta gama de classes utilitárias de baixo nível diretamente no HTML/JSX para estilizar </w:t>
+      </w:r>
+      <w:r>
+        <w:t>elementos (</w:t>
+      </w:r>
+      <w:r>
+        <w:t>WATHAN, 2017</w:t>
+      </w:r>
+      <w:r>
+        <w:t>). Essa abordagem acelera significativamen</w:t>
+      </w:r>
+      <w:r>
+        <w:t xml:space="preserve">te o processo de </w:t>
+      </w:r>
+      <w:r>
         <w:t>design</w:t>
       </w:r>
       <w:r>
         <w:t xml:space="preserve"> e desenvolvimento, eliminando a necessidade de escrever CSS customizado para a maioria dos componentes. Ele também facilita a criação de </w:t>
       </w:r>
       <w:r>
-        <w:rPr>
-          <w:i/>
-          <w:iCs/>
-        </w:rPr>
         <w:t>designs</w:t>
       </w:r>
       <w:r>
         <w:t xml:space="preserve"> responsivos por padrão, com classes específicas para diferentes tamanhos de tela, garantindo que a aplicação se adapte perfeitamente a dispositivos móveis, </w:t>
       </w:r>
       <w:r>
-        <w:rPr>
-          <w:i/>
-          <w:iCs/>
-        </w:rPr>
-        <w:t>tablets</w:t>
-      </w:r>
-      <w:r>
-        <w:t xml:space="preserve"> e </w:t>
-      </w:r>
-      <w:r>
-        <w:rPr>
-          <w:i/>
-          <w:iCs/>
-        </w:rPr>
-        <w:t>desktops</w:t>
-      </w:r>
-      <w:r>
-        <w:t xml:space="preserve"> </w:t>
-      </w:r>
-      <w:r>
-        <w:rPr>
-          <w:highlight w:val="yellow"/>
-        </w:rPr>
-        <w:t>(ADAMS, 2017)</w:t>
-      </w:r>
-      <w:r>
-        <w:t>.</w:t>
+        <w:t xml:space="preserve">tablets e </w:t>
+      </w:r>
+      <w:r>
+        <w:t>desktops (</w:t>
+      </w:r>
+      <w:r>
+        <w:t>WATHAN</w:t>
+      </w:r>
+      <w:r>
+        <w:t>, 2017).</w:t>
       </w:r>
     </w:p>
     <w:p>
@@ -3858,10 +3844,6 @@
       </w:r>
       <w:proofErr w:type="spellStart"/>
       <w:r>
-        <w:rPr>
-          <w:i/>
-          <w:iCs/>
-        </w:rPr>
         <w:t>Tailwind</w:t>
       </w:r>
       <w:proofErr w:type="spellEnd"/>
@@ -3869,20 +3851,12 @@
         <w:t xml:space="preserve"> CSS é utilizado para estilizar todos os componentes da interface do usuário do </w:t>
       </w:r>
       <w:r>
-        <w:rPr>
-          <w:i/>
-          <w:iCs/>
-        </w:rPr>
         <w:t>React.js</w:t>
       </w:r>
       <w:r>
         <w:t xml:space="preserve">. Ele garante a aplicação de um </w:t>
       </w:r>
       <w:r>
-        <w:rPr>
-          <w:i/>
-          <w:iCs/>
-        </w:rPr>
         <w:t>design</w:t>
       </w:r>
       <w:r>
@@ -3919,31 +3893,22 @@
       <w:r>
         <w:t xml:space="preserve">A camada de </w:t>
       </w:r>
-      <w:r>
-        <w:rPr>
-          <w:i/>
-          <w:iCs/>
-        </w:rPr>
-        <w:t>Back-</w:t>
-      </w:r>
-      <w:proofErr w:type="spellStart"/>
-      <w:r>
-        <w:rPr>
-          <w:i/>
-          <w:iCs/>
-        </w:rPr>
-        <w:t>end</w:t>
+      <w:proofErr w:type="spellStart"/>
+      <w:r>
+        <w:t>b</w:t>
+      </w:r>
+      <w:r>
+        <w:t>ack-end</w:t>
       </w:r>
       <w:proofErr w:type="spellEnd"/>
       <w:r>
         <w:t xml:space="preserve"> é o cérebro da aplicação, responsável pela lógica de negócio, autenticação, interação com o banco de dados e exposição de APIs para o </w:t>
       </w:r>
       <w:r>
-        <w:rPr>
-          <w:i/>
-          <w:iCs/>
-        </w:rPr>
-        <w:t>Front-end</w:t>
+        <w:t>f</w:t>
+      </w:r>
+      <w:r>
+        <w:t>ront-end</w:t>
       </w:r>
       <w:r>
         <w:t>.</w:t>
@@ -4005,7 +3970,13 @@
         <w:t xml:space="preserve">bloqueante construído sobre o motor V8 do </w:t>
       </w:r>
       <w:r>
-        <w:t>Google Chrome (DAHL, 2010)</w:t>
+        <w:t>Google Chrome (DAHL, 201</w:t>
+      </w:r>
+      <w:r>
+        <w:t>1</w:t>
+      </w:r>
+      <w:r>
+        <w:t>)</w:t>
       </w:r>
       <w:r>
         <w:t xml:space="preserve">. Sua escolha se justifica pela capacidade de lidar com um grande número de conexões simultâneas de forma eficiente, ideal para aplicações que exigem tempo real ou alta concorrência. Permite o uso </w:t>
@@ -4050,11 +4021,29 @@
         <w:t xml:space="preserve">), o que otimiza o aprendizado e a troca de contexto para o desenvolvedor. É altamente escalável e possui um ecossistema robusto de pacotes </w:t>
       </w:r>
       <w:r>
+        <w:t>(CANTELON</w:t>
+      </w:r>
+      <w:r>
+        <w:t xml:space="preserve">; HARTER; </w:t>
+      </w:r>
+      <w:r>
+        <w:t>HOLOWAYCHUK</w:t>
+      </w:r>
+      <w:r>
+        <w:t xml:space="preserve">; </w:t>
+      </w:r>
+      <w:r>
+        <w:t>RAJLICH</w:t>
+      </w:r>
+      <w:r>
+        <w:t>, 2013</w:t>
+      </w:r>
+      <w:r>
         <w:rPr>
           <w:i/>
           <w:iCs/>
         </w:rPr>
-        <w:t>(CANTELON, 2013)</w:t>
+        <w:t>)</w:t>
       </w:r>
       <w:r>
         <w:t>.</w:t>
@@ -4077,14 +4066,19 @@
       <w:r>
         <w:t xml:space="preserve"> serve como a base para o servidor da aplicação, executando toda a lógica de negócio do </w:t>
       </w:r>
-      <w:r>
-        <w:t>Sistema Colaborativo</w:t>
-      </w:r>
+      <w:proofErr w:type="spellStart"/>
+      <w:r>
+        <w:t>ReqCidadão</w:t>
+      </w:r>
+      <w:proofErr w:type="spellEnd"/>
       <w:r>
         <w:t xml:space="preserve">. Ele gerencia as requisições HTTP do </w:t>
       </w:r>
       <w:r>
-        <w:t>Front-</w:t>
+        <w:t>f</w:t>
+      </w:r>
+      <w:r>
+        <w:t>ront-</w:t>
       </w:r>
       <w:proofErr w:type="spellStart"/>
       <w:r>
@@ -4132,39 +4126,24 @@
       </w:r>
       <w:proofErr w:type="spellStart"/>
       <w:r>
-        <w:rPr>
-          <w:i/>
-          <w:iCs/>
-        </w:rPr>
         <w:t>RESTful</w:t>
       </w:r>
       <w:proofErr w:type="spellEnd"/>
       <w:r>
-        <w:t xml:space="preserve"> e aplicações web </w:t>
-      </w:r>
-      <w:r>
-        <w:rPr>
-          <w:highlight w:val="yellow"/>
-        </w:rPr>
-        <w:t>(TJ, [s.d.])</w:t>
-      </w:r>
-      <w:r>
-        <w:t xml:space="preserve">. Sua leveza e extensibilidade permitem criar uma estrutura personalizada para o </w:t>
-      </w:r>
-      <w:r>
-        <w:rPr>
-          <w:i/>
-          <w:iCs/>
-        </w:rPr>
-        <w:t>Back-</w:t>
-      </w:r>
-      <w:proofErr w:type="spellStart"/>
-      <w:r>
-        <w:rPr>
-          <w:i/>
-          <w:iCs/>
-        </w:rPr>
-        <w:t>end</w:t>
+        <w:t xml:space="preserve"> e aplicações </w:t>
+      </w:r>
+      <w:r>
+        <w:t>web (TJ, [s.d.]). Sua</w:t>
+      </w:r>
+      <w:r>
+        <w:t xml:space="preserve"> leveza e extensibilidade permitem criar uma estrutura personalizada para o </w:t>
+      </w:r>
+      <w:proofErr w:type="spellStart"/>
+      <w:r>
+        <w:t>b</w:t>
+      </w:r>
+      <w:r>
+        <w:t>ack-end</w:t>
       </w:r>
       <w:proofErr w:type="spellEnd"/>
       <w:r>
@@ -4183,18 +4162,13 @@
         <w:t xml:space="preserve">Aplicação: O Express é utilizado para definir as rotas da API REST que o </w:t>
       </w:r>
       <w:r>
-        <w:rPr>
-          <w:i/>
-          <w:iCs/>
-        </w:rPr>
-        <w:t>Front-</w:t>
-      </w:r>
-      <w:proofErr w:type="spellStart"/>
-      <w:r>
-        <w:rPr>
-          <w:i/>
-          <w:iCs/>
-        </w:rPr>
+        <w:t>f</w:t>
+      </w:r>
+      <w:r>
+        <w:t>ront-</w:t>
+      </w:r>
+      <w:proofErr w:type="spellStart"/>
+      <w:r>
         <w:t>end</w:t>
       </w:r>
       <w:proofErr w:type="spellEnd"/>
@@ -4238,18 +4212,10 @@
         <w:t xml:space="preserve">A persistência dos dados é um pilar fundamental para o sistema, e para isso, o </w:t>
       </w:r>
       <w:r>
-        <w:rPr>
-          <w:i/>
-          <w:iCs/>
-        </w:rPr>
         <w:t xml:space="preserve">Google </w:t>
       </w:r>
       <w:proofErr w:type="spellStart"/>
       <w:r>
-        <w:rPr>
-          <w:i/>
-          <w:iCs/>
-        </w:rPr>
         <w:t>Firebase</w:t>
       </w:r>
       <w:proofErr w:type="spellEnd"/>
@@ -4258,10 +4224,6 @@
       </w:r>
       <w:proofErr w:type="spellStart"/>
       <w:r>
-        <w:rPr>
-          <w:i/>
-          <w:iCs/>
-        </w:rPr>
         <w:t>Firestore</w:t>
       </w:r>
       <w:proofErr w:type="spellEnd"/>
@@ -4286,18 +4248,10 @@
         <w:t xml:space="preserve">Justificativa: O </w:t>
       </w:r>
       <w:r>
-        <w:rPr>
-          <w:i/>
-          <w:iCs/>
-        </w:rPr>
         <w:t xml:space="preserve">Google </w:t>
       </w:r>
       <w:proofErr w:type="spellStart"/>
       <w:r>
-        <w:rPr>
-          <w:i/>
-          <w:iCs/>
-        </w:rPr>
         <w:t>Firebase</w:t>
       </w:r>
       <w:proofErr w:type="spellEnd"/>
@@ -4306,10 +4260,6 @@
       </w:r>
       <w:proofErr w:type="spellStart"/>
       <w:r>
-        <w:rPr>
-          <w:i/>
-          <w:iCs/>
-        </w:rPr>
         <w:t>backend</w:t>
       </w:r>
       <w:proofErr w:type="spellEnd"/>
@@ -4325,27 +4275,16 @@
         <w:t xml:space="preserve">), incluindo autenticação, armazenamento e banco de dados </w:t>
       </w:r>
       <w:r>
-        <w:rPr>
-          <w:highlight w:val="yellow"/>
-        </w:rPr>
         <w:t>(GOOGLE, [s.d.])</w:t>
       </w:r>
       <w:r>
         <w:t xml:space="preserve">. A escolha do </w:t>
       </w:r>
       <w:r>
-        <w:rPr>
-          <w:i/>
-          <w:iCs/>
-        </w:rPr>
         <w:t xml:space="preserve">Cloud </w:t>
       </w:r>
       <w:proofErr w:type="spellStart"/>
       <w:r>
-        <w:rPr>
-          <w:i/>
-          <w:iCs/>
-        </w:rPr>
         <w:t>Firestore</w:t>
       </w:r>
       <w:proofErr w:type="spellEnd"/>
@@ -4354,10 +4293,6 @@
       </w:r>
       <w:proofErr w:type="spellStart"/>
       <w:r>
-        <w:rPr>
-          <w:i/>
-          <w:iCs/>
-        </w:rPr>
         <w:t>NoSQL</w:t>
       </w:r>
       <w:proofErr w:type="spellEnd"/>
@@ -4369,23 +4304,14 @@
         <w:t xml:space="preserve">integração, escalabilidade automática e recursos de sincronização de dados em tempo real, que são cruciais para um sistema onde as atualizações de ocorrências e respostas precisam ser rapidamente refletidas para os usuários </w:t>
       </w:r>
       <w:r>
-        <w:rPr>
-          <w:highlight w:val="yellow"/>
-        </w:rPr>
         <w:t>(GOOGLE, [</w:t>
       </w:r>
       <w:proofErr w:type="gramStart"/>
       <w:r>
-        <w:rPr>
-          <w:highlight w:val="yellow"/>
-        </w:rPr>
         <w:t>s.d.]b</w:t>
       </w:r>
       <w:proofErr w:type="gramEnd"/>
       <w:r>
-        <w:rPr>
-          <w:highlight w:val="yellow"/>
-        </w:rPr>
         <w:t>)</w:t>
       </w:r>
       <w:r>
@@ -4393,10 +4319,6 @@
       </w:r>
       <w:proofErr w:type="spellStart"/>
       <w:r>
-        <w:rPr>
-          <w:i/>
-          <w:iCs/>
-        </w:rPr>
         <w:t>serverless</w:t>
       </w:r>
       <w:proofErr w:type="spellEnd"/>
@@ -4405,10 +4327,6 @@
       </w:r>
       <w:proofErr w:type="spellStart"/>
       <w:r>
-        <w:rPr>
-          <w:i/>
-          <w:iCs/>
-        </w:rPr>
         <w:t>Firebase</w:t>
       </w:r>
       <w:proofErr w:type="spellEnd"/>
@@ -4429,10 +4347,6 @@
       </w:r>
       <w:proofErr w:type="spellStart"/>
       <w:r>
-        <w:rPr>
-          <w:i/>
-          <w:iCs/>
-        </w:rPr>
         <w:t>Firestore</w:t>
       </w:r>
       <w:proofErr w:type="spellEnd"/>
@@ -4494,18 +4408,10 @@
         <w:t xml:space="preserve">É importante ressaltar que o conceito de ORM, tradicionalmente aplicado a bancos de dados relacionais para mapear objetos de código a tabelas de banco de dados, não se aplica diretamente ao </w:t>
       </w:r>
       <w:r>
-        <w:rPr>
-          <w:i/>
-          <w:iCs/>
-        </w:rPr>
         <w:t xml:space="preserve">Cloud </w:t>
       </w:r>
       <w:proofErr w:type="spellStart"/>
       <w:r>
-        <w:rPr>
-          <w:i/>
-          <w:iCs/>
-        </w:rPr>
         <w:t>Firestore</w:t>
       </w:r>
       <w:proofErr w:type="spellEnd"/>
@@ -4514,10 +4420,6 @@
       </w:r>
       <w:proofErr w:type="spellStart"/>
       <w:r>
-        <w:rPr>
-          <w:i/>
-          <w:iCs/>
-        </w:rPr>
         <w:t>NoSQL</w:t>
       </w:r>
       <w:proofErr w:type="spellEnd"/>
@@ -4534,10 +4436,6 @@
       </w:r>
       <w:proofErr w:type="spellStart"/>
       <w:r>
-        <w:rPr>
-          <w:i/>
-          <w:iCs/>
-        </w:rPr>
         <w:t>Firestore</w:t>
       </w:r>
       <w:proofErr w:type="spellEnd"/>
@@ -4546,55 +4444,19 @@
       </w:r>
       <w:proofErr w:type="spellStart"/>
       <w:r>
-        <w:rPr>
-          <w:i/>
-          <w:iCs/>
-        </w:rPr>
         <w:t>Firebase</w:t>
       </w:r>
       <w:proofErr w:type="spellEnd"/>
       <w:r>
-        <w:rPr>
-          <w:i/>
-          <w:iCs/>
-        </w:rPr>
-        <w:t xml:space="preserve"> SDK</w:t>
-      </w:r>
-      <w:r>
-        <w:t xml:space="preserve"> (</w:t>
-      </w:r>
-      <w:r>
-        <w:rPr>
-          <w:i/>
-          <w:iCs/>
-        </w:rPr>
-        <w:t xml:space="preserve">Software </w:t>
-      </w:r>
-      <w:proofErr w:type="spellStart"/>
-      <w:r>
-        <w:rPr>
-          <w:i/>
-          <w:iCs/>
-        </w:rPr>
+        <w:t xml:space="preserve"> SDK (Software </w:t>
+      </w:r>
+      <w:proofErr w:type="spellStart"/>
+      <w:r>
         <w:t>Development</w:t>
       </w:r>
       <w:proofErr w:type="spellEnd"/>
       <w:r>
-        <w:rPr>
-          <w:i/>
-          <w:iCs/>
-        </w:rPr>
-        <w:t xml:space="preserve"> Kit</w:t>
-      </w:r>
-      <w:r>
-        <w:t xml:space="preserve">) para </w:t>
-      </w:r>
-      <w:r>
-        <w:rPr>
-          <w:i/>
-          <w:iCs/>
-        </w:rPr>
-        <w:t>Node.js</w:t>
+        <w:t xml:space="preserve"> Kit) para Node.js</w:t>
       </w:r>
       <w:r>
         <w:t>. Este SDK fornece métodos e interfaces que permitem realizar operações de CRUD (</w:t>
@@ -4616,23 +4478,14 @@
         <w:t xml:space="preserve">, Update, Delete) em coleções e documentos de forma programática, abstraindo as complexidades da comunicação com o banco de dados </w:t>
       </w:r>
       <w:r>
-        <w:rPr>
-          <w:highlight w:val="yellow"/>
-        </w:rPr>
         <w:t>(GOOGLE, [</w:t>
       </w:r>
       <w:proofErr w:type="gramStart"/>
       <w:r>
-        <w:rPr>
-          <w:highlight w:val="yellow"/>
-        </w:rPr>
         <w:t>s.d.]a</w:t>
       </w:r>
       <w:proofErr w:type="gramEnd"/>
       <w:r>
-        <w:rPr>
-          <w:highlight w:val="yellow"/>
-        </w:rPr>
         <w:t>)</w:t>
       </w:r>
       <w:r>
@@ -4647,18 +4500,10 @@
         <w:t>Para manter a organização e facilitar a manutenção do código, são utilizadas camadas de acesso a dados (</w:t>
       </w:r>
       <w:r>
-        <w:rPr>
-          <w:i/>
-          <w:iCs/>
-        </w:rPr>
         <w:t xml:space="preserve">Data Access </w:t>
       </w:r>
       <w:proofErr w:type="spellStart"/>
       <w:r>
-        <w:rPr>
-          <w:i/>
-          <w:iCs/>
-        </w:rPr>
         <w:t>Layers</w:t>
       </w:r>
       <w:proofErr w:type="spellEnd"/>
@@ -4675,10 +4520,6 @@
       </w:r>
       <w:proofErr w:type="spellStart"/>
       <w:r>
-        <w:rPr>
-          <w:i/>
-          <w:iCs/>
-        </w:rPr>
         <w:t>TypeScript</w:t>
       </w:r>
       <w:proofErr w:type="spellEnd"/>
@@ -4687,10 +4528,6 @@
       </w:r>
       <w:proofErr w:type="spellStart"/>
       <w:r>
-        <w:rPr>
-          <w:i/>
-          <w:iCs/>
-        </w:rPr>
         <w:t>JavaScript</w:t>
       </w:r>
       <w:proofErr w:type="spellEnd"/>
@@ -4699,10 +4536,6 @@
       </w:r>
       <w:proofErr w:type="spellStart"/>
       <w:r>
-        <w:rPr>
-          <w:i/>
-          <w:iCs/>
-        </w:rPr>
         <w:t>Firestore</w:t>
       </w:r>
       <w:proofErr w:type="spellEnd"/>
@@ -4750,7 +4583,7 @@
         <w:t>Web Tokens</w:t>
       </w:r>
       <w:r>
-        <w:t xml:space="preserve"> (JWT) é um padrão aberto (RFC 7519) para a criação de </w:t>
+        <w:t xml:space="preserve"> (JWT) é um padrão aberto para a criação de </w:t>
       </w:r>
       <w:r>
         <w:rPr>
@@ -4760,16 +4593,25 @@
         <w:t>tokens</w:t>
       </w:r>
       <w:r>
-        <w:t xml:space="preserve"> de acesso que permitem a troca segura de informações entre partes </w:t>
-      </w:r>
-      <w:r>
-        <w:rPr>
-          <w:highlight w:val="yellow"/>
-        </w:rPr>
-        <w:t>(IETF, 2015)</w:t>
-      </w:r>
-      <w:r>
-        <w:t xml:space="preserve">. Sua natureza </w:t>
+        <w:t xml:space="preserve"> de acesso que permitem a troca segura de informações entre </w:t>
+      </w:r>
+      <w:r>
+        <w:t>partes (</w:t>
+      </w:r>
+      <w:r>
+        <w:t>BATTISTI</w:t>
+      </w:r>
+      <w:r>
+        <w:t>, 20</w:t>
+      </w:r>
+      <w:r>
+        <w:t>21</w:t>
+      </w:r>
+      <w:r>
+        <w:t>). Sua</w:t>
+      </w:r>
+      <w:r>
+        <w:t xml:space="preserve"> natureza </w:t>
       </w:r>
       <w:proofErr w:type="spellStart"/>
       <w:r>
@@ -4799,7 +4641,10 @@
         <w:t>tokens</w:t>
       </w:r>
       <w:r>
-        <w:t xml:space="preserve"> são assinados digitalmente, garantindo sua integridade e autenticidade.</w:t>
+        <w:t xml:space="preserve"> são assinados digitalmente, garantindo sua integridade e autenticidade</w:t>
+      </w:r>
+      <w:r>
+        <w:t xml:space="preserve"> (IETF, 2015).</w:t>
       </w:r>
     </w:p>
     <w:p>
@@ -5075,16 +4920,13 @@
       </w:r>
       <w:proofErr w:type="spellEnd"/>
       <w:r>
-        <w:t xml:space="preserve"> é um sistema de controle de versão distribuído que permite rastrear mudanças no código-fonte, reverter para versões anteriores e gerenciar o desenvolvimento colaborativo </w:t>
-      </w:r>
-      <w:r>
-        <w:rPr>
-          <w:highlight w:val="yellow"/>
-        </w:rPr>
-        <w:t>(CHACON; STRAUB, 2014)</w:t>
-      </w:r>
-      <w:r>
-        <w:t xml:space="preserve">. O </w:t>
+        <w:t xml:space="preserve"> é um sistema de controle de versão distribuído que permite rastrear mudanças no código-fonte, reverter para versões anteriores e gerenciar o desenvolvimento </w:t>
+      </w:r>
+      <w:r>
+        <w:t>colaborativo (CHACON; STRAUB, 2014).</w:t>
+      </w:r>
+      <w:r>
+        <w:t xml:space="preserve"> O </w:t>
       </w:r>
       <w:r>
         <w:rPr>
@@ -5102,16 +4944,13 @@
       </w:r>
       <w:proofErr w:type="spellEnd"/>
       <w:r>
-        <w:t xml:space="preserve"> que oferece recursos adicionais para colaboração, revisão de código e gerenciamento de projetos </w:t>
-      </w:r>
-      <w:r>
-        <w:rPr>
-          <w:highlight w:val="yellow"/>
-        </w:rPr>
-        <w:t>(GITHUB, [s.d.])</w:t>
-      </w:r>
-      <w:r>
-        <w:t xml:space="preserve">. A combinação dessas ferramentas é um padrão da indústria para garantir a integridade do código, facilitar o trabalho em equipe (mesmo que individual no contexto do TCC, para histórico e organização) e integrar com processos de </w:t>
+        <w:t xml:space="preserve"> que oferece recursos adicionais para colaboração, revisão de código e gerenciamento de </w:t>
+      </w:r>
+      <w:r>
+        <w:t>projetos (GITHUB, [s.d.]).</w:t>
+      </w:r>
+      <w:r>
+        <w:t xml:space="preserve"> A combinação dessas ferramentas é um padrão da indústria para garantir a integridade do código, facilitar o trabalho em equipe (mesmo que individual no contexto do TCC, para histórico e organização) e integrar com processos de </w:t>
       </w:r>
       <w:proofErr w:type="spellStart"/>
       <w:r>
@@ -5176,12 +5015,11 @@
       <w:r>
         <w:t xml:space="preserve"> do </w:t>
       </w:r>
-      <w:r>
-        <w:rPr>
-          <w:highlight w:val="yellow"/>
-        </w:rPr>
-        <w:t>Sistema Colaborativo Cidadão-Governo</w:t>
-      </w:r>
+      <w:proofErr w:type="spellStart"/>
+      <w:r>
+        <w:t>ReqCidadão</w:t>
+      </w:r>
+      <w:proofErr w:type="spellEnd"/>
       <w:r>
         <w:t xml:space="preserve"> são </w:t>
       </w:r>
@@ -5585,7 +5423,7 @@
           </mc:Choice>
           <mc:Fallback>
             <w:pict>
-              <v:line w14:anchorId="36208C5E" id="Line 2" o:spid="_x0000_s1026" style="visibility:visible;mso-wrap-style:square;mso-left-percent:-10001;mso-top-percent:-10001;mso-position-horizontal:absolute;mso-position-horizontal-relative:char;mso-position-vertical:absolute;mso-position-vertical-relative:line;mso-left-percent:-10001;mso-top-percent:-10001" from="0,0" to="108.7pt,0" o:gfxdata="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" strokecolor="#e5cc80" strokeweight="2.25pt">
+              <v:line w14:anchorId="706D8959" id="Line 2" o:spid="_x0000_s1026" style="visibility:visible;mso-wrap-style:square;mso-left-percent:-10001;mso-top-percent:-10001;mso-position-horizontal:absolute;mso-position-horizontal-relative:char;mso-position-vertical:absolute;mso-position-vertical-relative:line;mso-left-percent:-10001;mso-top-percent:-10001" from="0,0" to="108.7pt,0" o:gfxdata="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" strokecolor="#e5cc80" strokeweight="2.25pt">
                 <w10:anchorlock/>
               </v:line>
             </w:pict>
@@ -5880,7 +5718,7 @@
           </mc:Choice>
           <mc:Fallback>
             <w:pict>
-              <v:line w14:anchorId="21C30456" id="Line 2" o:spid="_x0000_s1026" style="visibility:visible;mso-wrap-style:square;mso-left-percent:-10001;mso-top-percent:-10001;mso-position-horizontal:absolute;mso-position-horizontal-relative:char;mso-position-vertical:absolute;mso-position-vertical-relative:line;mso-left-percent:-10001;mso-top-percent:-10001" from="0,0" to="108.7pt,0" o:gfxdata="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" strokecolor="#e5cc80" strokeweight="2.25pt">
+              <v:line w14:anchorId="0915903E" id="Line 2" o:spid="_x0000_s1026" style="visibility:visible;mso-wrap-style:square;mso-left-percent:-10001;mso-top-percent:-10001;mso-position-horizontal:absolute;mso-position-horizontal-relative:char;mso-position-vertical:absolute;mso-position-vertical-relative:line;mso-left-percent:-10001;mso-top-percent:-10001" from="0,0" to="108.7pt,0" o:gfxdata="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" strokecolor="#e5cc80" strokeweight="2.25pt">
                 <w10:anchorlock/>
               </v:line>
             </w:pict>
@@ -6137,7 +5975,7 @@
           </mc:Choice>
           <mc:Fallback>
             <w:pict>
-              <v:line w14:anchorId="170DFA4E" id="Line 2" o:spid="_x0000_s1026" style="visibility:visible;mso-wrap-style:square;mso-left-percent:-10001;mso-top-percent:-10001;mso-position-horizontal:absolute;mso-position-horizontal-relative:char;mso-position-vertical:absolute;mso-position-vertical-relative:line;mso-left-percent:-10001;mso-top-percent:-10001" from="0,0" to="108.7pt,0" o:gfxdata="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" strokecolor="#e5cc80" strokeweight="2.25pt">
+              <v:line w14:anchorId="4C7526E6" id="Line 2" o:spid="_x0000_s1026" style="visibility:visible;mso-wrap-style:square;mso-left-percent:-10001;mso-top-percent:-10001;mso-position-horizontal:absolute;mso-position-horizontal-relative:char;mso-position-vertical:absolute;mso-position-vertical-relative:line;mso-left-percent:-10001;mso-top-percent:-10001" from="0,0" to="108.7pt,0" o:gfxdata="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" strokecolor="#e5cc80" strokeweight="2.25pt">
                 <w10:anchorlock/>
               </v:line>
             </w:pict>
@@ -6161,15 +5999,168 @@
     <w:p>
       <w:pPr>
         <w:pStyle w:val="CorpodaReferncia"/>
-      </w:pPr>
-      <w:r>
-        <w:t>Citar todas as referências utilizadas no trabalho</w:t>
-      </w:r>
+        <w:numPr>
+          <w:ilvl w:val="0"/>
+          <w:numId w:val="20"/>
+        </w:numPr>
+      </w:pPr>
+      <w:r>
+        <w:t>PORTO</w:t>
+      </w:r>
+      <w:r>
+        <w:t>, Dan</w:t>
+      </w:r>
+      <w:r>
+        <w:t>iel</w:t>
+      </w:r>
+      <w:r>
+        <w:t xml:space="preserve">. </w:t>
+      </w:r>
+      <w:r>
+        <w:t xml:space="preserve">O que é </w:t>
+      </w:r>
+      <w:proofErr w:type="spellStart"/>
+      <w:r>
+        <w:t>ReactJ</w:t>
+      </w:r>
+      <w:r>
+        <w:t>s</w:t>
+      </w:r>
+      <w:proofErr w:type="spellEnd"/>
+      <w:r>
+        <w:t>? Como Funciona e Principais Aplicações</w:t>
+      </w:r>
+      <w:r>
+        <w:t>. 20</w:t>
+      </w:r>
+      <w:r>
+        <w:t>24</w:t>
+      </w:r>
+      <w:r>
+        <w:t>. Disponível em: &lt;</w:t>
+      </w:r>
+      <w:r>
+        <w:t>https://www.youtube.com/</w:t>
+      </w:r>
+      <w:proofErr w:type="spellStart"/>
+      <w:r>
+        <w:t>watch?v</w:t>
+      </w:r>
+      <w:proofErr w:type="spellEnd"/>
+      <w:r>
+        <w:t>=J9pFbdtNe1c</w:t>
+      </w:r>
+      <w:r>
+        <w:t xml:space="preserve">&gt;. Acesso em: </w:t>
+      </w:r>
+      <w:r>
+        <w:t>05/02/2026</w:t>
+      </w:r>
+      <w:r>
+        <w:t>.</w:t>
+      </w:r>
+    </w:p>
+    <w:p>
+      <w:pPr>
+        <w:pStyle w:val="CorpodaReferncia"/>
+        <w:numPr>
+          <w:ilvl w:val="0"/>
+          <w:numId w:val="20"/>
+        </w:numPr>
+      </w:pPr>
+      <w:r>
+        <w:rPr>
+          <w:lang w:val="en-US"/>
+        </w:rPr>
+        <w:t>WATHAN</w:t>
+      </w:r>
+      <w:r>
+        <w:rPr>
+          <w:lang w:val="en-US"/>
+        </w:rPr>
+        <w:t xml:space="preserve">, Adam. </w:t>
+      </w:r>
+      <w:r>
+        <w:rPr>
+          <w:lang w:val="en-US"/>
+        </w:rPr>
+        <w:t>CSS Utility Classes and "Separation of Concerns"</w:t>
+      </w:r>
+      <w:r>
+        <w:rPr>
+          <w:lang w:val="en-US"/>
+        </w:rPr>
+        <w:t xml:space="preserve">. 2017. </w:t>
+      </w:r>
+      <w:r>
+        <w:t xml:space="preserve">Disponível em: </w:t>
+      </w:r>
+      <w:r>
+        <w:t>&lt;</w:t>
+      </w:r>
+      <w:r>
+        <w:t>https://adamwathan.me/css-utility-classes-and-separation-of-concerns/</w:t>
+      </w:r>
+      <w:r>
+        <w:t>&gt;</w:t>
+      </w:r>
+      <w:r>
+        <w:t xml:space="preserve">. Acesso em: </w:t>
+      </w:r>
+      <w:r>
+        <w:t>05/02/2026</w:t>
+      </w:r>
+      <w:r>
+        <w:t>.</w:t>
+      </w:r>
+    </w:p>
+    <w:p>
+      <w:pPr>
+        <w:pStyle w:val="CorpodaReferncia"/>
+        <w:numPr>
+          <w:ilvl w:val="0"/>
+          <w:numId w:val="20"/>
+        </w:numPr>
+      </w:pPr>
+      <w:r>
+        <w:rPr>
+          <w:lang w:val="en-US"/>
+        </w:rPr>
+        <w:t xml:space="preserve">DAHL, Ryan. </w:t>
+      </w:r>
+      <w:proofErr w:type="spellStart"/>
+      <w:r>
+        <w:t>Introduction</w:t>
+      </w:r>
+      <w:proofErr w:type="spellEnd"/>
       <w:r>
         <w:t xml:space="preserve"> </w:t>
       </w:r>
-      <w:r>
-        <w:t>(seguir as normas da ABNT)</w:t>
+      <w:proofErr w:type="spellStart"/>
+      <w:r>
+        <w:t>to</w:t>
+      </w:r>
+      <w:proofErr w:type="spellEnd"/>
+      <w:r>
+        <w:t xml:space="preserve"> </w:t>
+      </w:r>
+      <w:r>
+        <w:t>Node.js. 201</w:t>
+      </w:r>
+      <w:r>
+        <w:t>1</w:t>
+      </w:r>
+      <w:r>
+        <w:t>. Disponível em: &lt;</w:t>
+      </w:r>
+      <w:r>
+        <w:t xml:space="preserve"> </w:t>
+      </w:r>
+      <w:r>
+        <w:t xml:space="preserve">https://www.youtube.com/watch?v=jo_B4LTHi3I&gt;. Acesso em: </w:t>
+      </w:r>
+      <w:r>
+        <w:t>06/02/2026</w:t>
       </w:r>
       <w:r>
         <w:t>.</w:t>
@@ -6178,6 +6169,404 @@
     <w:p>
       <w:pPr>
         <w:pStyle w:val="CorpodaReferncia"/>
+        <w:numPr>
+          <w:ilvl w:val="0"/>
+          <w:numId w:val="20"/>
+        </w:numPr>
+        <w:rPr>
+          <w:lang w:val="en-US"/>
+        </w:rPr>
+      </w:pPr>
+      <w:r>
+        <w:rPr>
+          <w:lang w:val="en-US"/>
+        </w:rPr>
+        <w:t xml:space="preserve">CANTELON, Mike; </w:t>
+      </w:r>
+      <w:r>
+        <w:rPr>
+          <w:lang w:val="en-US"/>
+        </w:rPr>
+        <w:t>HARTER, Marc; HOLOWAYCHUK, T.J.; RAJLICH, Nathan</w:t>
+      </w:r>
+      <w:r>
+        <w:rPr>
+          <w:lang w:val="en-US"/>
+        </w:rPr>
+        <w:t xml:space="preserve">. Node.js in Action. </w:t>
+      </w:r>
+      <w:r>
+        <w:rPr>
+          <w:lang w:val="en-US"/>
+        </w:rPr>
+        <w:t>1. ed. Shelter Island, NY: Manning Publications Co., 2013.</w:t>
+      </w:r>
+    </w:p>
+    <w:p>
+      <w:pPr>
+        <w:pStyle w:val="CorpodaReferncia"/>
+        <w:numPr>
+          <w:ilvl w:val="0"/>
+          <w:numId w:val="20"/>
+        </w:numPr>
+      </w:pPr>
+      <w:r>
+        <w:rPr>
+          <w:lang w:val="en-US"/>
+        </w:rPr>
+        <w:t>TJ. Express - Fast, unopinionated, minimalist web framework for Node.js. [</w:t>
+      </w:r>
+      <w:proofErr w:type="spellStart"/>
+      <w:r>
+        <w:rPr>
+          <w:lang w:val="en-US"/>
+        </w:rPr>
+        <w:t>s.d.</w:t>
+      </w:r>
+      <w:proofErr w:type="spellEnd"/>
+      <w:r>
+        <w:rPr>
+          <w:lang w:val="en-US"/>
+        </w:rPr>
+        <w:t xml:space="preserve">]. </w:t>
+      </w:r>
+      <w:r>
+        <w:t>Disponível em: expressjs.com. Acesso em: 06/02/2026.</w:t>
+      </w:r>
+    </w:p>
+    <w:p>
+      <w:pPr>
+        <w:pStyle w:val="CorpodaReferncia"/>
+        <w:numPr>
+          <w:ilvl w:val="0"/>
+          <w:numId w:val="20"/>
+        </w:numPr>
+      </w:pPr>
+      <w:r>
+        <w:t xml:space="preserve">GOOGLE. Cloud </w:t>
+      </w:r>
+      <w:proofErr w:type="spellStart"/>
+      <w:r>
+        <w:t>Firestore</w:t>
+      </w:r>
+      <w:proofErr w:type="spellEnd"/>
+      <w:r>
+        <w:t>: Banco de dados de documentos para desenvolvimento de apps. [</w:t>
+      </w:r>
+      <w:proofErr w:type="gramStart"/>
+      <w:r>
+        <w:t>s.d.]b.</w:t>
+      </w:r>
+      <w:proofErr w:type="gramEnd"/>
+      <w:r>
+        <w:t xml:space="preserve"> Disponível em: firebase.google.com. Acesso em: </w:t>
+      </w:r>
+      <w:r>
+        <w:t>07/02/2026</w:t>
+      </w:r>
+      <w:r>
+        <w:t>.</w:t>
+      </w:r>
+    </w:p>
+    <w:p>
+      <w:pPr>
+        <w:pStyle w:val="CorpodaReferncia"/>
+        <w:numPr>
+          <w:ilvl w:val="0"/>
+          <w:numId w:val="20"/>
+        </w:numPr>
+      </w:pPr>
+      <w:r>
+        <w:t xml:space="preserve">GOOGLE. </w:t>
+      </w:r>
+      <w:proofErr w:type="spellStart"/>
+      <w:r>
+        <w:t>Firebase</w:t>
+      </w:r>
+      <w:proofErr w:type="spellEnd"/>
+      <w:r>
+        <w:t xml:space="preserve">: Plataforma de desenvolvimento de apps. [s.d.]. Disponível em: firebase.google.com. Acesso em: </w:t>
+      </w:r>
+      <w:r>
+        <w:t>07/02/2026</w:t>
+      </w:r>
+      <w:r>
+        <w:t>.</w:t>
+      </w:r>
+    </w:p>
+    <w:p>
+      <w:pPr>
+        <w:pStyle w:val="CorpodaReferncia"/>
+        <w:numPr>
+          <w:ilvl w:val="0"/>
+          <w:numId w:val="20"/>
+        </w:numPr>
+      </w:pPr>
+      <w:r>
+        <w:t xml:space="preserve">GOOGLE. </w:t>
+      </w:r>
+      <w:proofErr w:type="spellStart"/>
+      <w:r>
+        <w:t>SDKs</w:t>
+      </w:r>
+      <w:proofErr w:type="spellEnd"/>
+      <w:r>
+        <w:t xml:space="preserve"> do </w:t>
+      </w:r>
+      <w:proofErr w:type="spellStart"/>
+      <w:r>
+        <w:t>Firebase</w:t>
+      </w:r>
+      <w:proofErr w:type="spellEnd"/>
+      <w:r>
+        <w:t>. [</w:t>
+      </w:r>
+      <w:proofErr w:type="gramStart"/>
+      <w:r>
+        <w:t>s.d.]a.</w:t>
+      </w:r>
+      <w:proofErr w:type="gramEnd"/>
+      <w:r>
+        <w:t xml:space="preserve"> Disponível em: firebase.google.com. Acesso em: </w:t>
+      </w:r>
+      <w:r>
+        <w:t>07/02/2026</w:t>
+      </w:r>
+      <w:r>
+        <w:t>.</w:t>
+      </w:r>
+    </w:p>
+    <w:p>
+      <w:pPr>
+        <w:pStyle w:val="CorpodaReferncia"/>
+        <w:numPr>
+          <w:ilvl w:val="0"/>
+          <w:numId w:val="20"/>
+        </w:numPr>
+      </w:pPr>
+      <w:r>
+        <w:t>BATTISTI</w:t>
+      </w:r>
+      <w:r>
+        <w:t xml:space="preserve">, </w:t>
+      </w:r>
+      <w:r>
+        <w:t>Matheus</w:t>
+      </w:r>
+      <w:r>
+        <w:t xml:space="preserve">. </w:t>
+      </w:r>
+      <w:r>
+        <w:t>O que é JWT? Aprenda tudo sobre JSON Web Token</w:t>
+      </w:r>
+      <w:r>
+        <w:t>. Disponível em: &lt;https://www.youtube.com/</w:t>
+      </w:r>
+      <w:proofErr w:type="spellStart"/>
+      <w:r>
+        <w:t>watch?v</w:t>
+      </w:r>
+      <w:proofErr w:type="spellEnd"/>
+      <w:r>
+        <w:t>=</w:t>
+      </w:r>
+      <w:proofErr w:type="spellStart"/>
+      <w:r>
+        <w:t>sHyoMWnnLGU</w:t>
+      </w:r>
+      <w:proofErr w:type="spellEnd"/>
+      <w:r>
+        <w:t>&gt;. Acesso em: 0</w:t>
+      </w:r>
+      <w:r>
+        <w:t>8</w:t>
+      </w:r>
+      <w:r>
+        <w:t>/02/2026.</w:t>
+      </w:r>
+    </w:p>
+    <w:p>
+      <w:pPr>
+        <w:pStyle w:val="CorpodaReferncia"/>
+        <w:numPr>
+          <w:ilvl w:val="0"/>
+          <w:numId w:val="20"/>
+        </w:numPr>
+      </w:pPr>
+      <w:r>
+        <w:rPr>
+          <w:lang w:val="en-US"/>
+        </w:rPr>
+        <w:t xml:space="preserve">IETF. RFC 7519: JSON Web Token (JWT). 2015. </w:t>
+      </w:r>
+      <w:r>
+        <w:t xml:space="preserve">Disponível em: datatracker.ietf.org. Acesso em: </w:t>
+      </w:r>
+      <w:r>
+        <w:t>08/02/2026</w:t>
+      </w:r>
+      <w:r>
+        <w:t>.</w:t>
+      </w:r>
+    </w:p>
+    <w:p>
+      <w:pPr>
+        <w:pStyle w:val="CorpodaReferncia"/>
+        <w:numPr>
+          <w:ilvl w:val="0"/>
+          <w:numId w:val="20"/>
+        </w:numPr>
+        <w:rPr>
+          <w:lang w:val="en-US"/>
+        </w:rPr>
+      </w:pPr>
+      <w:r>
+        <w:rPr>
+          <w:lang w:val="en-US"/>
+        </w:rPr>
+        <w:t xml:space="preserve">CHACON, Scott; STRAUB, Ben. Pro Git. 2. ed. New York, NY: </w:t>
+      </w:r>
+      <w:proofErr w:type="spellStart"/>
+      <w:r>
+        <w:rPr>
+          <w:lang w:val="en-US"/>
+        </w:rPr>
+        <w:t>Apress</w:t>
+      </w:r>
+      <w:proofErr w:type="spellEnd"/>
+      <w:r>
+        <w:rPr>
+          <w:lang w:val="en-US"/>
+        </w:rPr>
+        <w:t>, 2014.</w:t>
+      </w:r>
+    </w:p>
+    <w:p>
+      <w:pPr>
+        <w:pStyle w:val="CorpodaReferncia"/>
+        <w:numPr>
+          <w:ilvl w:val="0"/>
+          <w:numId w:val="20"/>
+        </w:numPr>
+      </w:pPr>
+      <w:r>
+        <w:t xml:space="preserve">GITHUB. </w:t>
+      </w:r>
+      <w:proofErr w:type="spellStart"/>
+      <w:r>
+        <w:t>About</w:t>
+      </w:r>
+      <w:proofErr w:type="spellEnd"/>
+      <w:r>
+        <w:t xml:space="preserve"> GitHub. [s.d.]. Disponível em: github.com. Acesso em: </w:t>
+      </w:r>
+      <w:r>
+        <w:t>12/02/2026</w:t>
+      </w:r>
+      <w:r>
+        <w:t>.</w:t>
+      </w:r>
+    </w:p>
+    <w:p>
+      <w:pPr>
+        <w:pStyle w:val="CorpodaReferncia"/>
+        <w:numPr>
+          <w:ilvl w:val="0"/>
+          <w:numId w:val="20"/>
+        </w:numPr>
+      </w:pPr>
+      <w:r>
+        <w:rPr>
+          <w:lang w:val="en-US"/>
+        </w:rPr>
+        <w:t xml:space="preserve">DOCKER. What is a </w:t>
+      </w:r>
+      <w:proofErr w:type="gramStart"/>
+      <w:r>
+        <w:rPr>
+          <w:lang w:val="en-US"/>
+        </w:rPr>
+        <w:t>Container?.</w:t>
+      </w:r>
+      <w:proofErr w:type="gramEnd"/>
+      <w:r>
+        <w:rPr>
+          <w:lang w:val="en-US"/>
+        </w:rPr>
+        <w:t xml:space="preserve"> </w:t>
+      </w:r>
+      <w:r>
+        <w:t xml:space="preserve">[s.d.]. Disponível em: www.docker.com. Acesso em: </w:t>
+      </w:r>
+      <w:r>
+        <w:t>14/02/2026</w:t>
+      </w:r>
+      <w:r>
+        <w:t>.</w:t>
+      </w:r>
+    </w:p>
+    <w:p>
+      <w:pPr>
+        <w:pStyle w:val="CorpodaReferncia"/>
+        <w:numPr>
+          <w:ilvl w:val="0"/>
+          <w:numId w:val="20"/>
+        </w:numPr>
+      </w:pPr>
+      <w:r>
+        <w:rPr>
+          <w:lang w:val="en-US"/>
+        </w:rPr>
+        <w:t xml:space="preserve">FACEBOOK. React – A JavaScript library for building user interfaces. </w:t>
+      </w:r>
+      <w:r>
+        <w:t xml:space="preserve">[s.d.]. Disponível em: </w:t>
+      </w:r>
+      <w:proofErr w:type="spellStart"/>
+      <w:r>
+        <w:t>react.dev</w:t>
+      </w:r>
+      <w:proofErr w:type="spellEnd"/>
+      <w:r>
+        <w:t xml:space="preserve">. Acesso em: </w:t>
+      </w:r>
+      <w:r>
+        <w:t>05/02/2026</w:t>
+      </w:r>
+      <w:r>
+        <w:t>.</w:t>
+      </w:r>
+    </w:p>
+    <w:p>
+      <w:pPr>
+        <w:pStyle w:val="CorpodaReferncia"/>
+        <w:numPr>
+          <w:ilvl w:val="0"/>
+          <w:numId w:val="20"/>
+        </w:numPr>
+      </w:pPr>
+      <w:r>
+        <w:rPr>
+          <w:lang w:val="en-US"/>
+        </w:rPr>
+        <w:t xml:space="preserve">TAILWIND LABS. Tailwind CSS: A utility-first CSS framework. </w:t>
+      </w:r>
+      <w:r>
+        <w:t xml:space="preserve">[s.d.]. Disponível em: tailwindcss.com. Acesso em: </w:t>
+      </w:r>
+      <w:r>
+        <w:t>05/02/2026</w:t>
+      </w:r>
+      <w:r>
+        <w:t>.</w:t>
+      </w:r>
+    </w:p>
+    <w:p>
+      <w:pPr>
+        <w:pStyle w:val="CorpodaReferncia"/>
+        <w:rPr>
+          <w:color w:val="auto"/>
+        </w:rPr>
       </w:pPr>
     </w:p>
     <w:p>
@@ -6294,16 +6683,6 @@
 </file>
 
 <file path=word/footer1.xml><?xml version="1.0" encoding="utf-8"?>
-<w:ftr xmlns:wpc="http://schemas.microsoft.com/office/word/2010/wordprocessingCanvas" xmlns:cx="http://schemas.microsoft.com/office/drawing/2014/chartex" xmlns:cx1="http://schemas.microsoft.com/office/drawing/2015/9/8/chartex" xmlns:cx2="http://schemas.microsoft.com/office/drawing/2015/10/21/chartex" xmlns:cx3="http://schemas.microsoft.com/office/drawing/2016/5/9/chartex" xmlns:cx4="http://schemas.microsoft.com/office/drawing/2016/5/10/chartex" xmlns:cx5="http://schemas.microsoft.com/office/drawing/2016/5/11/chartex" xmlns:cx6="http://schemas.microsoft.com/office/drawing/2016/5/12/chartex" xmlns:cx7="http://schemas.microsoft.com/office/drawing/2016/5/13/chartex" xmlns:cx8="http://schemas.microsoft.com/office/drawing/2016/5/14/chartex" xmlns:mc="http://schemas.openxmlformats.org/markup-compatibility/2006" xmlns:aink="http://schemas.microsoft.com/office/drawing/2016/ink" xmlns:am3d="http://schemas.microsoft.com/office/drawing/2017/model3d" xmlns:o="urn:schemas-microsoft-com:office:office" xmlns:oel="http://schemas.microsoft.com/office/2019/extlst" xmlns:r="http://schemas.openxmlformats.org/officeDocument/2006/relationships" xmlns:m="http://schemas.openxmlformats.org/officeDocument/2006/math" xmlns:v="urn:schemas-microsoft-com:vml" xmlns:wp14="http://schemas.microsoft.com/office/word/2010/wordprocessingDrawing" xmlns:wp="http://schemas.openxmlformats.org/drawingml/2006/wordprocessingDrawing" xmlns:w10="urn:schemas-microsoft-com:office:word" xmlns:w="http://schemas.openxmlformats.org/wordprocessingml/2006/main" xmlns:w14="http://schemas.microsoft.com/office/word/2010/wordml" xmlns:w15="http://schemas.microsoft.com/office/word/2012/wordml" xmlns:w16cex="http://schemas.microsoft.com/office/word/2018/wordml/cex" xmlns:w16cid="http://schemas.microsoft.com/office/word/2016/wordml/cid" xmlns:w16="http://schemas.microsoft.com/office/word/2018/wordml" xmlns:w16du="http://schemas.microsoft.com/office/word/2023/wordml/word16du" xmlns:w16sdtdh="http://schemas.microsoft.com/office/word/2020/wordml/sdtdatahash" xmlns:w16sdtfl="http://schemas.microsoft.com/office/word/2024/wordml/sdtformatlock" xmlns:w16se="http://schemas.microsoft.com/office/word/2015/wordml/symex" xmlns:wpg="http://schemas.microsoft.com/office/word/2010/wordprocessingGroup" xmlns:wpi="http://schemas.microsoft.com/office/word/2010/wordprocessingInk" xmlns:wne="http://schemas.microsoft.com/office/word/2006/wordml" xmlns:wps="http://schemas.microsoft.com/office/word/2010/wordprocessingShape" mc:Ignorable="w14 w15 w16se w16cid w16 w16cex w16sdtdh w16sdtfl w16du wp14">
-  <w:p>
-    <w:pPr>
-      <w:pStyle w:val="Rodap"/>
-    </w:pPr>
-  </w:p>
-</w:ftr>
-</file>
-
-<file path=word/footer2.xml><?xml version="1.0" encoding="utf-8"?>
 <w:ftr xmlns:wpc="http://schemas.microsoft.com/office/word/2010/wordprocessingCanvas" xmlns:cx="http://schemas.microsoft.com/office/drawing/2014/chartex" xmlns:cx1="http://schemas.microsoft.com/office/drawing/2015/9/8/chartex" xmlns:cx2="http://schemas.microsoft.com/office/drawing/2015/10/21/chartex" xmlns:cx3="http://schemas.microsoft.com/office/drawing/2016/5/9/chartex" xmlns:cx4="http://schemas.microsoft.com/office/drawing/2016/5/10/chartex" xmlns:cx5="http://schemas.microsoft.com/office/drawing/2016/5/11/chartex" xmlns:cx6="http://schemas.microsoft.com/office/drawing/2016/5/12/chartex" xmlns:cx7="http://schemas.microsoft.com/office/drawing/2016/5/13/chartex" xmlns:cx8="http://schemas.microsoft.com/office/drawing/2016/5/14/chartex" xmlns:mc="http://schemas.openxmlformats.org/markup-compatibility/2006" xmlns:aink="http://schemas.microsoft.com/office/drawing/2016/ink" xmlns:am3d="http://schemas.microsoft.com/office/drawing/2017/model3d" xmlns:o="urn:schemas-microsoft-com:office:office" xmlns:oel="http://schemas.microsoft.com/office/2019/extlst" xmlns:r="http://schemas.openxmlformats.org/officeDocument/2006/relationships" xmlns:m="http://schemas.openxmlformats.org/officeDocument/2006/math" xmlns:v="urn:schemas-microsoft-com:vml" xmlns:wp14="http://schemas.microsoft.com/office/word/2010/wordprocessingDrawing" xmlns:wp="http://schemas.openxmlformats.org/drawingml/2006/wordprocessingDrawing" xmlns:w10="urn:schemas-microsoft-com:office:word" xmlns:w="http://schemas.openxmlformats.org/wordprocessingml/2006/main" xmlns:w14="http://schemas.microsoft.com/office/word/2010/wordml" xmlns:w15="http://schemas.microsoft.com/office/word/2012/wordml" xmlns:w16cex="http://schemas.microsoft.com/office/word/2018/wordml/cex" xmlns:w16cid="http://schemas.microsoft.com/office/word/2016/wordml/cid" xmlns:w16="http://schemas.microsoft.com/office/word/2018/wordml" xmlns:w16du="http://schemas.microsoft.com/office/word/2023/wordml/word16du" xmlns:w16sdtdh="http://schemas.microsoft.com/office/word/2020/wordml/sdtdatahash" xmlns:w16sdtfl="http://schemas.microsoft.com/office/word/2024/wordml/sdtformatlock" xmlns:w16se="http://schemas.microsoft.com/office/word/2015/wordml/symex" xmlns:wpg="http://schemas.microsoft.com/office/word/2010/wordprocessingGroup" xmlns:wpi="http://schemas.microsoft.com/office/word/2010/wordprocessingInk" xmlns:wne="http://schemas.microsoft.com/office/word/2006/wordml" xmlns:wps="http://schemas.microsoft.com/office/word/2010/wordprocessingShape" mc:Ignorable="w14 w15 w16se w16cid w16 w16cex w16sdtdh w16sdtfl w16du wp14">
   <w:p>
     <w:pPr>
@@ -6387,7 +6766,7 @@
         </mc:Choice>
         <mc:Fallback>
           <w:pict>
-            <v:rect w14:anchorId="2A73B71E" id="Retângulo 6" o:spid="_x0000_s1026" style="position:absolute;margin-left:-100.25pt;margin-top:11.45pt;width:613.25pt;height:36.4pt;z-index:-251654144;visibility:visible;mso-wrap-style:square;mso-width-percent:0;mso-height-percent:0;mso-wrap-distance-left:9pt;mso-wrap-distance-top:0;mso-wrap-distance-right:9pt;mso-wrap-distance-bottom:0;mso-position-horizontal:absolute;mso-position-horizontal-relative:text;mso-position-vertical:absolute;mso-position-vertical-relative:text;mso-width-percent:0;mso-height-percent:0;mso-width-relative:margin;mso-height-relative:margin;v-text-anchor:middle" o:gfxdata="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" fillcolor="#203644" stroked="f" strokeweight="1pt"/>
+            <v:rect w14:anchorId="03FF9BD5" id="Retângulo 6" o:spid="_x0000_s1026" style="position:absolute;margin-left:-100.25pt;margin-top:11.45pt;width:613.25pt;height:36.4pt;z-index:-251654144;visibility:visible;mso-wrap-style:square;mso-width-percent:0;mso-height-percent:0;mso-wrap-distance-left:9pt;mso-wrap-distance-top:0;mso-wrap-distance-right:9pt;mso-wrap-distance-bottom:0;mso-position-horizontal:absolute;mso-position-horizontal-relative:text;mso-position-vertical:absolute;mso-position-vertical-relative:text;mso-width-percent:0;mso-height-percent:0;mso-width-relative:margin;mso-height-relative:margin;v-text-anchor:middle" o:gfxdata="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" fillcolor="#203644" stroked="f" strokeweight="1pt"/>
           </w:pict>
         </mc:Fallback>
       </mc:AlternateContent>
@@ -6467,17 +6846,7 @@
 </w:ftr>
 </file>
 
-<file path=word/footer3.xml><?xml version="1.0" encoding="utf-8"?>
-<w:ftr xmlns:wpc="http://schemas.microsoft.com/office/word/2010/wordprocessingCanvas" xmlns:cx="http://schemas.microsoft.com/office/drawing/2014/chartex" xmlns:cx1="http://schemas.microsoft.com/office/drawing/2015/9/8/chartex" xmlns:cx2="http://schemas.microsoft.com/office/drawing/2015/10/21/chartex" xmlns:cx3="http://schemas.microsoft.com/office/drawing/2016/5/9/chartex" xmlns:cx4="http://schemas.microsoft.com/office/drawing/2016/5/10/chartex" xmlns:cx5="http://schemas.microsoft.com/office/drawing/2016/5/11/chartex" xmlns:cx6="http://schemas.microsoft.com/office/drawing/2016/5/12/chartex" xmlns:cx7="http://schemas.microsoft.com/office/drawing/2016/5/13/chartex" xmlns:cx8="http://schemas.microsoft.com/office/drawing/2016/5/14/chartex" xmlns:mc="http://schemas.openxmlformats.org/markup-compatibility/2006" xmlns:aink="http://schemas.microsoft.com/office/drawing/2016/ink" xmlns:am3d="http://schemas.microsoft.com/office/drawing/2017/model3d" xmlns:o="urn:schemas-microsoft-com:office:office" xmlns:oel="http://schemas.microsoft.com/office/2019/extlst" xmlns:r="http://schemas.openxmlformats.org/officeDocument/2006/relationships" xmlns:m="http://schemas.openxmlformats.org/officeDocument/2006/math" xmlns:v="urn:schemas-microsoft-com:vml" xmlns:wp14="http://schemas.microsoft.com/office/word/2010/wordprocessingDrawing" xmlns:wp="http://schemas.openxmlformats.org/drawingml/2006/wordprocessingDrawing" xmlns:w10="urn:schemas-microsoft-com:office:word" xmlns:w="http://schemas.openxmlformats.org/wordprocessingml/2006/main" xmlns:w14="http://schemas.microsoft.com/office/word/2010/wordml" xmlns:w15="http://schemas.microsoft.com/office/word/2012/wordml" xmlns:w16cex="http://schemas.microsoft.com/office/word/2018/wordml/cex" xmlns:w16cid="http://schemas.microsoft.com/office/word/2016/wordml/cid" xmlns:w16="http://schemas.microsoft.com/office/word/2018/wordml" xmlns:w16du="http://schemas.microsoft.com/office/word/2023/wordml/word16du" xmlns:w16sdtdh="http://schemas.microsoft.com/office/word/2020/wordml/sdtdatahash" xmlns:w16sdtfl="http://schemas.microsoft.com/office/word/2024/wordml/sdtformatlock" xmlns:w16se="http://schemas.microsoft.com/office/word/2015/wordml/symex" xmlns:wpg="http://schemas.microsoft.com/office/word/2010/wordprocessingGroup" xmlns:wpi="http://schemas.microsoft.com/office/word/2010/wordprocessingInk" xmlns:wne="http://schemas.microsoft.com/office/word/2006/wordml" xmlns:wps="http://schemas.microsoft.com/office/word/2010/wordprocessingShape" mc:Ignorable="w14 w15 w16se w16cid w16 w16cex w16sdtdh w16sdtfl w16du wp14">
-  <w:p>
-    <w:pPr>
-      <w:pStyle w:val="Rodap"/>
-    </w:pPr>
-  </w:p>
-</w:ftr>
-</file>
-
-<file path=word/footer4.xml><?xml version="1.0" encoding="utf-8"?>
+<file path=word/footer2.xml><?xml version="1.0" encoding="utf-8"?>
 <w:ftr xmlns:wpc="http://schemas.microsoft.com/office/word/2010/wordprocessingCanvas" xmlns:cx="http://schemas.microsoft.com/office/drawing/2014/chartex" xmlns:cx1="http://schemas.microsoft.com/office/drawing/2015/9/8/chartex" xmlns:cx2="http://schemas.microsoft.com/office/drawing/2015/10/21/chartex" xmlns:cx3="http://schemas.microsoft.com/office/drawing/2016/5/9/chartex" xmlns:cx4="http://schemas.microsoft.com/office/drawing/2016/5/10/chartex" xmlns:cx5="http://schemas.microsoft.com/office/drawing/2016/5/11/chartex" xmlns:cx6="http://schemas.microsoft.com/office/drawing/2016/5/12/chartex" xmlns:cx7="http://schemas.microsoft.com/office/drawing/2016/5/13/chartex" xmlns:cx8="http://schemas.microsoft.com/office/drawing/2016/5/14/chartex" xmlns:mc="http://schemas.openxmlformats.org/markup-compatibility/2006" xmlns:aink="http://schemas.microsoft.com/office/drawing/2016/ink" xmlns:am3d="http://schemas.microsoft.com/office/drawing/2017/model3d" xmlns:o="urn:schemas-microsoft-com:office:office" xmlns:oel="http://schemas.microsoft.com/office/2019/extlst" xmlns:r="http://schemas.openxmlformats.org/officeDocument/2006/relationships" xmlns:m="http://schemas.openxmlformats.org/officeDocument/2006/math" xmlns:v="urn:schemas-microsoft-com:vml" xmlns:wp14="http://schemas.microsoft.com/office/word/2010/wordprocessingDrawing" xmlns:wp="http://schemas.openxmlformats.org/drawingml/2006/wordprocessingDrawing" xmlns:w10="urn:schemas-microsoft-com:office:word" xmlns:w="http://schemas.openxmlformats.org/wordprocessingml/2006/main" xmlns:w14="http://schemas.microsoft.com/office/word/2010/wordml" xmlns:w15="http://schemas.microsoft.com/office/word/2012/wordml" xmlns:w16cex="http://schemas.microsoft.com/office/word/2018/wordml/cex" xmlns:w16cid="http://schemas.microsoft.com/office/word/2016/wordml/cid" xmlns:w16="http://schemas.microsoft.com/office/word/2018/wordml" xmlns:w16du="http://schemas.microsoft.com/office/word/2023/wordml/word16du" xmlns:w16sdtdh="http://schemas.microsoft.com/office/word/2020/wordml/sdtdatahash" xmlns:w16sdtfl="http://schemas.microsoft.com/office/word/2024/wordml/sdtformatlock" xmlns:w16se="http://schemas.microsoft.com/office/word/2015/wordml/symex" xmlns:wpg="http://schemas.microsoft.com/office/word/2010/wordprocessingGroup" xmlns:wpi="http://schemas.microsoft.com/office/word/2010/wordprocessingInk" xmlns:wne="http://schemas.microsoft.com/office/word/2006/wordml" xmlns:wps="http://schemas.microsoft.com/office/word/2010/wordprocessingShape" mc:Ignorable="w14 w15 w16se w16cid w16 w16cex w16sdtdh w16sdtfl w16du wp14">
   <w:p>
     <w:pPr>
@@ -6561,7 +6930,7 @@
         </mc:Choice>
         <mc:Fallback>
           <w:pict>
-            <v:rect w14:anchorId="047EB9CB" id="Retângulo 13" o:spid="_x0000_s1026" style="position:absolute;margin-left:-102.85pt;margin-top:12.15pt;width:613.25pt;height:36.4pt;z-index:-251657216;visibility:visible;mso-wrap-style:square;mso-width-percent:0;mso-height-percent:0;mso-wrap-distance-left:9pt;mso-wrap-distance-top:0;mso-wrap-distance-right:9pt;mso-wrap-distance-bottom:0;mso-position-horizontal:absolute;mso-position-horizontal-relative:text;mso-position-vertical:absolute;mso-position-vertical-relative:text;mso-width-percent:0;mso-height-percent:0;mso-width-relative:margin;mso-height-relative:margin;v-text-anchor:middle" o:gfxdata="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" fillcolor="#203644" stroked="f" strokeweight="1pt"/>
+            <v:rect w14:anchorId="52317E54" id="Retângulo 13" o:spid="_x0000_s1026" style="position:absolute;margin-left:-102.85pt;margin-top:12.15pt;width:613.25pt;height:36.4pt;z-index:-251657216;visibility:visible;mso-wrap-style:square;mso-width-percent:0;mso-height-percent:0;mso-wrap-distance-left:9pt;mso-wrap-distance-top:0;mso-wrap-distance-right:9pt;mso-wrap-distance-bottom:0;mso-position-horizontal:absolute;mso-position-horizontal-relative:text;mso-position-vertical:absolute;mso-position-vertical-relative:text;mso-width-percent:0;mso-height-percent:0;mso-width-relative:margin;mso-height-relative:margin;v-text-anchor:middle" o:gfxdata="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" fillcolor="#203644" stroked="f" strokeweight="1pt"/>
           </w:pict>
         </mc:Fallback>
       </mc:AlternateContent>
@@ -6669,36 +7038,6 @@
 </file>
 
 <file path=word/header1.xml><?xml version="1.0" encoding="utf-8"?>
-<w:hdr xmlns:wpc="http://schemas.microsoft.com/office/word/2010/wordprocessingCanvas" xmlns:cx="http://schemas.microsoft.com/office/drawing/2014/chartex" xmlns:cx1="http://schemas.microsoft.com/office/drawing/2015/9/8/chartex" xmlns:cx2="http://schemas.microsoft.com/office/drawing/2015/10/21/chartex" xmlns:cx3="http://schemas.microsoft.com/office/drawing/2016/5/9/chartex" xmlns:cx4="http://schemas.microsoft.com/office/drawing/2016/5/10/chartex" xmlns:cx5="http://schemas.microsoft.com/office/drawing/2016/5/11/chartex" xmlns:cx6="http://schemas.microsoft.com/office/drawing/2016/5/12/chartex" xmlns:cx7="http://schemas.microsoft.com/office/drawing/2016/5/13/chartex" xmlns:cx8="http://schemas.microsoft.com/office/drawing/2016/5/14/chartex" xmlns:mc="http://schemas.openxmlformats.org/markup-compatibility/2006" xmlns:aink="http://schemas.microsoft.com/office/drawing/2016/ink" xmlns:am3d="http://schemas.microsoft.com/office/drawing/2017/model3d" xmlns:o="urn:schemas-microsoft-com:office:office" xmlns:oel="http://schemas.microsoft.com/office/2019/extlst" xmlns:r="http://schemas.openxmlformats.org/officeDocument/2006/relationships" xmlns:m="http://schemas.openxmlformats.org/officeDocument/2006/math" xmlns:v="urn:schemas-microsoft-com:vml" xmlns:wp14="http://schemas.microsoft.com/office/word/2010/wordprocessingDrawing" xmlns:wp="http://schemas.openxmlformats.org/drawingml/2006/wordprocessingDrawing" xmlns:w10="urn:schemas-microsoft-com:office:word" xmlns:w="http://schemas.openxmlformats.org/wordprocessingml/2006/main" xmlns:w14="http://schemas.microsoft.com/office/word/2010/wordml" xmlns:w15="http://schemas.microsoft.com/office/word/2012/wordml" xmlns:w16cex="http://schemas.microsoft.com/office/word/2018/wordml/cex" xmlns:w16cid="http://schemas.microsoft.com/office/word/2016/wordml/cid" xmlns:w16="http://schemas.microsoft.com/office/word/2018/wordml" xmlns:w16du="http://schemas.microsoft.com/office/word/2023/wordml/word16du" xmlns:w16sdtdh="http://schemas.microsoft.com/office/word/2020/wordml/sdtdatahash" xmlns:w16sdtfl="http://schemas.microsoft.com/office/word/2024/wordml/sdtformatlock" xmlns:w16se="http://schemas.microsoft.com/office/word/2015/wordml/symex" xmlns:wpg="http://schemas.microsoft.com/office/word/2010/wordprocessingGroup" xmlns:wpi="http://schemas.microsoft.com/office/word/2010/wordprocessingInk" xmlns:wne="http://schemas.microsoft.com/office/word/2006/wordml" xmlns:wps="http://schemas.microsoft.com/office/word/2010/wordprocessingShape" mc:Ignorable="w14 w15 w16se w16cid w16 w16cex w16sdtdh w16sdtfl w16du wp14">
-  <w:p>
-    <w:pPr>
-      <w:pStyle w:val="Cabealho"/>
-    </w:pPr>
-  </w:p>
-</w:hdr>
-</file>
-
-<file path=word/header2.xml><?xml version="1.0" encoding="utf-8"?>
-<w:hdr xmlns:wpc="http://schemas.microsoft.com/office/word/2010/wordprocessingCanvas" xmlns:cx="http://schemas.microsoft.com/office/drawing/2014/chartex" xmlns:cx1="http://schemas.microsoft.com/office/drawing/2015/9/8/chartex" xmlns:cx2="http://schemas.microsoft.com/office/drawing/2015/10/21/chartex" xmlns:cx3="http://schemas.microsoft.com/office/drawing/2016/5/9/chartex" xmlns:cx4="http://schemas.microsoft.com/office/drawing/2016/5/10/chartex" xmlns:cx5="http://schemas.microsoft.com/office/drawing/2016/5/11/chartex" xmlns:cx6="http://schemas.microsoft.com/office/drawing/2016/5/12/chartex" xmlns:cx7="http://schemas.microsoft.com/office/drawing/2016/5/13/chartex" xmlns:cx8="http://schemas.microsoft.com/office/drawing/2016/5/14/chartex" xmlns:mc="http://schemas.openxmlformats.org/markup-compatibility/2006" xmlns:aink="http://schemas.microsoft.com/office/drawing/2016/ink" xmlns:am3d="http://schemas.microsoft.com/office/drawing/2017/model3d" xmlns:o="urn:schemas-microsoft-com:office:office" xmlns:oel="http://schemas.microsoft.com/office/2019/extlst" xmlns:r="http://schemas.openxmlformats.org/officeDocument/2006/relationships" xmlns:m="http://schemas.openxmlformats.org/officeDocument/2006/math" xmlns:v="urn:schemas-microsoft-com:vml" xmlns:wp14="http://schemas.microsoft.com/office/word/2010/wordprocessingDrawing" xmlns:wp="http://schemas.openxmlformats.org/drawingml/2006/wordprocessingDrawing" xmlns:w10="urn:schemas-microsoft-com:office:word" xmlns:w="http://schemas.openxmlformats.org/wordprocessingml/2006/main" xmlns:w14="http://schemas.microsoft.com/office/word/2010/wordml" xmlns:w15="http://schemas.microsoft.com/office/word/2012/wordml" xmlns:w16cex="http://schemas.microsoft.com/office/word/2018/wordml/cex" xmlns:w16cid="http://schemas.microsoft.com/office/word/2016/wordml/cid" xmlns:w16="http://schemas.microsoft.com/office/word/2018/wordml" xmlns:w16du="http://schemas.microsoft.com/office/word/2023/wordml/word16du" xmlns:w16sdtdh="http://schemas.microsoft.com/office/word/2020/wordml/sdtdatahash" xmlns:w16sdtfl="http://schemas.microsoft.com/office/word/2024/wordml/sdtformatlock" xmlns:w16se="http://schemas.microsoft.com/office/word/2015/wordml/symex" xmlns:wpg="http://schemas.microsoft.com/office/word/2010/wordprocessingGroup" xmlns:wpi="http://schemas.microsoft.com/office/word/2010/wordprocessingInk" xmlns:wne="http://schemas.microsoft.com/office/word/2006/wordml" xmlns:wps="http://schemas.microsoft.com/office/word/2010/wordprocessingShape" mc:Ignorable="w14 w15 w16se w16cid w16 w16cex w16sdtdh w16sdtfl w16du wp14">
-  <w:p>
-    <w:pPr>
-      <w:pStyle w:val="Cabealho"/>
-    </w:pPr>
-  </w:p>
-</w:hdr>
-</file>
-
-<file path=word/header3.xml><?xml version="1.0" encoding="utf-8"?>
-<w:hdr xmlns:wpc="http://schemas.microsoft.com/office/word/2010/wordprocessingCanvas" xmlns:cx="http://schemas.microsoft.com/office/drawing/2014/chartex" xmlns:cx1="http://schemas.microsoft.com/office/drawing/2015/9/8/chartex" xmlns:cx2="http://schemas.microsoft.com/office/drawing/2015/10/21/chartex" xmlns:cx3="http://schemas.microsoft.com/office/drawing/2016/5/9/chartex" xmlns:cx4="http://schemas.microsoft.com/office/drawing/2016/5/10/chartex" xmlns:cx5="http://schemas.microsoft.com/office/drawing/2016/5/11/chartex" xmlns:cx6="http://schemas.microsoft.com/office/drawing/2016/5/12/chartex" xmlns:cx7="http://schemas.microsoft.com/office/drawing/2016/5/13/chartex" xmlns:cx8="http://schemas.microsoft.com/office/drawing/2016/5/14/chartex" xmlns:mc="http://schemas.openxmlformats.org/markup-compatibility/2006" xmlns:aink="http://schemas.microsoft.com/office/drawing/2016/ink" xmlns:am3d="http://schemas.microsoft.com/office/drawing/2017/model3d" xmlns:o="urn:schemas-microsoft-com:office:office" xmlns:oel="http://schemas.microsoft.com/office/2019/extlst" xmlns:r="http://schemas.openxmlformats.org/officeDocument/2006/relationships" xmlns:m="http://schemas.openxmlformats.org/officeDocument/2006/math" xmlns:v="urn:schemas-microsoft-com:vml" xmlns:wp14="http://schemas.microsoft.com/office/word/2010/wordprocessingDrawing" xmlns:wp="http://schemas.openxmlformats.org/drawingml/2006/wordprocessingDrawing" xmlns:w10="urn:schemas-microsoft-com:office:word" xmlns:w="http://schemas.openxmlformats.org/wordprocessingml/2006/main" xmlns:w14="http://schemas.microsoft.com/office/word/2010/wordml" xmlns:w15="http://schemas.microsoft.com/office/word/2012/wordml" xmlns:w16cex="http://schemas.microsoft.com/office/word/2018/wordml/cex" xmlns:w16cid="http://schemas.microsoft.com/office/word/2016/wordml/cid" xmlns:w16="http://schemas.microsoft.com/office/word/2018/wordml" xmlns:w16du="http://schemas.microsoft.com/office/word/2023/wordml/word16du" xmlns:w16sdtdh="http://schemas.microsoft.com/office/word/2020/wordml/sdtdatahash" xmlns:w16sdtfl="http://schemas.microsoft.com/office/word/2024/wordml/sdtformatlock" xmlns:w16se="http://schemas.microsoft.com/office/word/2015/wordml/symex" xmlns:wpg="http://schemas.microsoft.com/office/word/2010/wordprocessingGroup" xmlns:wpi="http://schemas.microsoft.com/office/word/2010/wordprocessingInk" xmlns:wne="http://schemas.microsoft.com/office/word/2006/wordml" xmlns:wps="http://schemas.microsoft.com/office/word/2010/wordprocessingShape" mc:Ignorable="w14 w15 w16se w16cid w16 w16cex w16sdtdh w16sdtfl w16du wp14">
-  <w:p>
-    <w:pPr>
-      <w:pStyle w:val="Cabealho"/>
-    </w:pPr>
-  </w:p>
-</w:hdr>
-</file>
-
-<file path=word/header4.xml><?xml version="1.0" encoding="utf-8"?>
 <w:hdr xmlns:wpc="http://schemas.microsoft.com/office/word/2010/wordprocessingCanvas" xmlns:cx="http://schemas.microsoft.com/office/drawing/2014/chartex" xmlns:cx1="http://schemas.microsoft.com/office/drawing/2015/9/8/chartex" xmlns:cx2="http://schemas.microsoft.com/office/drawing/2015/10/21/chartex" xmlns:cx3="http://schemas.microsoft.com/office/drawing/2016/5/9/chartex" xmlns:cx4="http://schemas.microsoft.com/office/drawing/2016/5/10/chartex" xmlns:cx5="http://schemas.microsoft.com/office/drawing/2016/5/11/chartex" xmlns:cx6="http://schemas.microsoft.com/office/drawing/2016/5/12/chartex" xmlns:cx7="http://schemas.microsoft.com/office/drawing/2016/5/13/chartex" xmlns:cx8="http://schemas.microsoft.com/office/drawing/2016/5/14/chartex" xmlns:mc="http://schemas.openxmlformats.org/markup-compatibility/2006" xmlns:aink="http://schemas.microsoft.com/office/drawing/2016/ink" xmlns:am3d="http://schemas.microsoft.com/office/drawing/2017/model3d" xmlns:o="urn:schemas-microsoft-com:office:office" xmlns:oel="http://schemas.microsoft.com/office/2019/extlst" xmlns:r="http://schemas.openxmlformats.org/officeDocument/2006/relationships" xmlns:m="http://schemas.openxmlformats.org/officeDocument/2006/math" xmlns:v="urn:schemas-microsoft-com:vml" xmlns:wp14="http://schemas.microsoft.com/office/word/2010/wordprocessingDrawing" xmlns:wp="http://schemas.openxmlformats.org/drawingml/2006/wordprocessingDrawing" xmlns:w10="urn:schemas-microsoft-com:office:word" xmlns:w="http://schemas.openxmlformats.org/wordprocessingml/2006/main" xmlns:w14="http://schemas.microsoft.com/office/word/2010/wordml" xmlns:w15="http://schemas.microsoft.com/office/word/2012/wordml" xmlns:w16cex="http://schemas.microsoft.com/office/word/2018/wordml/cex" xmlns:w16cid="http://schemas.microsoft.com/office/word/2016/wordml/cid" xmlns:w16="http://schemas.microsoft.com/office/word/2018/wordml" xmlns:w16du="http://schemas.microsoft.com/office/word/2023/wordml/word16du" xmlns:w16sdtdh="http://schemas.microsoft.com/office/word/2020/wordml/sdtdatahash" xmlns:w16sdtfl="http://schemas.microsoft.com/office/word/2024/wordml/sdtformatlock" xmlns:w16se="http://schemas.microsoft.com/office/word/2015/wordml/symex" xmlns:wpg="http://schemas.microsoft.com/office/word/2010/wordprocessingGroup" xmlns:wpi="http://schemas.microsoft.com/office/word/2010/wordprocessingInk" xmlns:wne="http://schemas.microsoft.com/office/word/2006/wordml" xmlns:wps="http://schemas.microsoft.com/office/word/2010/wordprocessingShape" mc:Ignorable="w14 w15 w16se w16cid w16 w16cex w16sdtdh w16sdtfl w16du wp14">
   <w:sdt>
     <w:sdtPr>
@@ -7042,6 +7381,92 @@
     </w:lvl>
   </w:abstractNum>
   <w:abstractNum w:abstractNumId="2" w15:restartNumberingAfterBreak="0">
+    <w:nsid w:val="4ADC118D"/>
+    <w:multiLevelType w:val="hybridMultilevel"/>
+    <w:tmpl w:val="F57E748C"/>
+    <w:lvl w:ilvl="0" w:tplc="0416000F">
+      <w:start w:val="1"/>
+      <w:numFmt w:val="decimal"/>
+      <w:lvlText w:val="%1."/>
+      <w:lvlJc w:val="left"/>
+      <w:pPr>
+        <w:ind w:left="720" w:hanging="360"/>
+      </w:pPr>
+    </w:lvl>
+    <w:lvl w:ilvl="1" w:tplc="04160019" w:tentative="1">
+      <w:start w:val="1"/>
+      <w:numFmt w:val="lowerLetter"/>
+      <w:lvlText w:val="%2."/>
+      <w:lvlJc w:val="left"/>
+      <w:pPr>
+        <w:ind w:left="1440" w:hanging="360"/>
+      </w:pPr>
+    </w:lvl>
+    <w:lvl w:ilvl="2" w:tplc="0416001B" w:tentative="1">
+      <w:start w:val="1"/>
+      <w:numFmt w:val="lowerRoman"/>
+      <w:lvlText w:val="%3."/>
+      <w:lvlJc w:val="right"/>
+      <w:pPr>
+        <w:ind w:left="2160" w:hanging="180"/>
+      </w:pPr>
+    </w:lvl>
+    <w:lvl w:ilvl="3" w:tplc="0416000F" w:tentative="1">
+      <w:start w:val="1"/>
+      <w:numFmt w:val="decimal"/>
+      <w:lvlText w:val="%4."/>
+      <w:lvlJc w:val="left"/>
+      <w:pPr>
+        <w:ind w:left="2880" w:hanging="360"/>
+      </w:pPr>
+    </w:lvl>
+    <w:lvl w:ilvl="4" w:tplc="04160019" w:tentative="1">
+      <w:start w:val="1"/>
+      <w:numFmt w:val="lowerLetter"/>
+      <w:lvlText w:val="%5."/>
+      <w:lvlJc w:val="left"/>
+      <w:pPr>
+        <w:ind w:left="3600" w:hanging="360"/>
+      </w:pPr>
+    </w:lvl>
+    <w:lvl w:ilvl="5" w:tplc="0416001B" w:tentative="1">
+      <w:start w:val="1"/>
+      <w:numFmt w:val="lowerRoman"/>
+      <w:lvlText w:val="%6."/>
+      <w:lvlJc w:val="right"/>
+      <w:pPr>
+        <w:ind w:left="4320" w:hanging="180"/>
+      </w:pPr>
+    </w:lvl>
+    <w:lvl w:ilvl="6" w:tplc="0416000F" w:tentative="1">
+      <w:start w:val="1"/>
+      <w:numFmt w:val="decimal"/>
+      <w:lvlText w:val="%7."/>
+      <w:lvlJc w:val="left"/>
+      <w:pPr>
+        <w:ind w:left="5040" w:hanging="360"/>
+      </w:pPr>
+    </w:lvl>
+    <w:lvl w:ilvl="7" w:tplc="04160019" w:tentative="1">
+      <w:start w:val="1"/>
+      <w:numFmt w:val="lowerLetter"/>
+      <w:lvlText w:val="%8."/>
+      <w:lvlJc w:val="left"/>
+      <w:pPr>
+        <w:ind w:left="5760" w:hanging="360"/>
+      </w:pPr>
+    </w:lvl>
+    <w:lvl w:ilvl="8" w:tplc="0416001B" w:tentative="1">
+      <w:start w:val="1"/>
+      <w:numFmt w:val="lowerRoman"/>
+      <w:lvlText w:val="%9."/>
+      <w:lvlJc w:val="right"/>
+      <w:pPr>
+        <w:ind w:left="6480" w:hanging="180"/>
+      </w:pPr>
+    </w:lvl>
+  </w:abstractNum>
+  <w:abstractNum w:abstractNumId="3" w15:restartNumberingAfterBreak="0">
     <w:nsid w:val="6AF57636"/>
     <w:multiLevelType w:val="multilevel"/>
     <w:tmpl w:val="C526C646"/>
@@ -7172,7 +7597,7 @@
       </w:rPr>
     </w:lvl>
   </w:abstractNum>
-  <w:abstractNum w:abstractNumId="3" w15:restartNumberingAfterBreak="0">
+  <w:abstractNum w:abstractNumId="4" w15:restartNumberingAfterBreak="0">
     <w:nsid w:val="78720726"/>
     <w:multiLevelType w:val="hybridMultilevel"/>
     <w:tmpl w:val="D08883C4"/>
@@ -7285,7 +7710,7 @@
       </w:rPr>
     </w:lvl>
   </w:abstractNum>
-  <w:abstractNum w:abstractNumId="4" w15:restartNumberingAfterBreak="0">
+  <w:abstractNum w:abstractNumId="5" w15:restartNumberingAfterBreak="0">
     <w:nsid w:val="7C2F5DF5"/>
     <w:multiLevelType w:val="hybridMultilevel"/>
     <w:tmpl w:val="B7CA7724"/>
@@ -7399,60 +7824,63 @@
     </w:lvl>
   </w:abstractNum>
   <w:num w:numId="1" w16cid:durableId="560824303">
-    <w:abstractNumId w:val="2"/>
+    <w:abstractNumId w:val="3"/>
   </w:num>
   <w:num w:numId="2" w16cid:durableId="1180509139">
-    <w:abstractNumId w:val="4"/>
+    <w:abstractNumId w:val="5"/>
   </w:num>
   <w:num w:numId="3" w16cid:durableId="500586901">
     <w:abstractNumId w:val="0"/>
   </w:num>
   <w:num w:numId="4" w16cid:durableId="174809497">
-    <w:abstractNumId w:val="2"/>
+    <w:abstractNumId w:val="3"/>
   </w:num>
   <w:num w:numId="5" w16cid:durableId="989754168">
-    <w:abstractNumId w:val="2"/>
+    <w:abstractNumId w:val="3"/>
   </w:num>
   <w:num w:numId="6" w16cid:durableId="988748899">
-    <w:abstractNumId w:val="2"/>
+    <w:abstractNumId w:val="3"/>
   </w:num>
   <w:num w:numId="7" w16cid:durableId="166795585">
-    <w:abstractNumId w:val="2"/>
+    <w:abstractNumId w:val="3"/>
   </w:num>
   <w:num w:numId="8" w16cid:durableId="1627392089">
+    <w:abstractNumId w:val="4"/>
+  </w:num>
+  <w:num w:numId="9" w16cid:durableId="485441320">
     <w:abstractNumId w:val="3"/>
   </w:num>
-  <w:num w:numId="9" w16cid:durableId="485441320">
-    <w:abstractNumId w:val="2"/>
-  </w:num>
   <w:num w:numId="10" w16cid:durableId="1930388155">
-    <w:abstractNumId w:val="2"/>
+    <w:abstractNumId w:val="3"/>
   </w:num>
   <w:num w:numId="11" w16cid:durableId="490951797">
-    <w:abstractNumId w:val="2"/>
+    <w:abstractNumId w:val="3"/>
   </w:num>
   <w:num w:numId="12" w16cid:durableId="2132551927">
-    <w:abstractNumId w:val="2"/>
+    <w:abstractNumId w:val="3"/>
   </w:num>
   <w:num w:numId="13" w16cid:durableId="109009057">
-    <w:abstractNumId w:val="2"/>
+    <w:abstractNumId w:val="3"/>
   </w:num>
   <w:num w:numId="14" w16cid:durableId="294794431">
-    <w:abstractNumId w:val="2"/>
+    <w:abstractNumId w:val="3"/>
   </w:num>
   <w:num w:numId="15" w16cid:durableId="250437619">
     <w:abstractNumId w:val="1"/>
   </w:num>
   <w:num w:numId="16" w16cid:durableId="769934979">
-    <w:abstractNumId w:val="2"/>
+    <w:abstractNumId w:val="3"/>
   </w:num>
   <w:num w:numId="17" w16cid:durableId="391075376">
-    <w:abstractNumId w:val="2"/>
+    <w:abstractNumId w:val="3"/>
   </w:num>
   <w:num w:numId="18" w16cid:durableId="226261706">
-    <w:abstractNumId w:val="2"/>
+    <w:abstractNumId w:val="3"/>
   </w:num>
   <w:num w:numId="19" w16cid:durableId="1148207479">
+    <w:abstractNumId w:val="3"/>
+  </w:num>
+  <w:num w:numId="20" w16cid:durableId="27680345">
     <w:abstractNumId w:val="2"/>
   </w:num>
 </w:numbering>

</xml_diff>

<commit_message>
atualização de mudanças antes da manutenção no notebook
</commit_message>
<xml_diff>
--- a/TCC/Memorial.docx
+++ b/TCC/Memorial.docx
@@ -717,14 +717,6 @@
               <w:color w:val="2F5496" w:themeColor="accent1" w:themeShade="BF"/>
               <w:sz w:val="24"/>
               <w:szCs w:val="24"/>
-              <w14:textFill>
-                <w14:solidFill>
-                  <w14:schemeClr w14:val="accent1">
-                    <w14:lumMod w14:val="75000"/>
-                    <w14:lumMod w14:val="75000"/>
-                  </w14:schemeClr>
-                </w14:solidFill>
-              </w14:textFill>
             </w:rPr>
           </w:pPr>
         </w:p>
@@ -2992,13 +2984,11 @@
         <w:t>onde o cidadão pode registrar um problema ou ocorrência de forma simplificada</w:t>
       </w:r>
       <w:r>
-        <w:t xml:space="preserve">, o Requerimento do Cidadão – </w:t>
-      </w:r>
-      <w:proofErr w:type="spellStart"/>
-      <w:r>
-        <w:t>ReqCidadão</w:t>
-      </w:r>
-      <w:proofErr w:type="spellEnd"/>
+        <w:t xml:space="preserve">, o </w:t>
+      </w:r>
+      <w:r>
+        <w:t>Sistema Colaborativo Cidadão-Governo</w:t>
+      </w:r>
       <w:r>
         <w:t>. Em contrapartida, um gestor público de uma esfera determinada (municipal, estadual ou até federal) poderia atuar e responder sobre essa questão, oferecendo uma solução ou um plano de ação claro e transparente. Este sistema não só democratiza o acesso à comunicação com o poder público, como também fornece à gestão uma rica base de dados para entender as necessidades da população e direcionar esforços de forma mais estratégica, pavimentando o caminho para futuras otimizações baseadas em análise de dados e, quem sabe, inteligência artificial.</w:t>
       </w:r>
@@ -3265,11 +3255,9 @@
       <w:r>
         <w:t xml:space="preserve">E, claro, com um significado especial, temos o projeto que resume toda essa formação: o </w:t>
       </w:r>
-      <w:proofErr w:type="spellStart"/>
-      <w:r>
-        <w:t>ReqCidadão</w:t>
-      </w:r>
-      <w:proofErr w:type="spellEnd"/>
+      <w:r>
+        <w:t>Sistema Colaborativo Cidadão-Governo</w:t>
+      </w:r>
       <w:r>
         <w:t xml:space="preserve">, cujo repositório está em </w:t>
       </w:r>
@@ -3462,13 +3450,22 @@
       <w:r>
         <w:t xml:space="preserve">A construção de uma solução completa como o </w:t>
       </w:r>
+      <w:r>
+        <w:t>Sistema Colaborativo Cidadão-Governo</w:t>
+      </w:r>
+      <w:r>
+        <w:t xml:space="preserve"> exige a seleção cuidadosa de tecnologias e ferramentas que garantam robustez, escalabilidade, segurança e uma excelente experiência de usuário. Para atender a esses requisitos, optou-se por uma </w:t>
+      </w:r>
       <w:proofErr w:type="spellStart"/>
       <w:r>
-        <w:t>ReqCidadão</w:t>
+        <w:t>stack</w:t>
       </w:r>
       <w:proofErr w:type="spellEnd"/>
       <w:r>
-        <w:t xml:space="preserve"> exige a seleção cuidadosa de tecnologias e ferramentas que garantam robustez, escalabilidade, segurança e uma excelente experiência de usuário. Para atender a esses requisitos, optou-se por uma </w:t>
+        <w:t xml:space="preserve"> tecnológica </w:t>
+      </w:r>
+      <w:r>
+        <w:t xml:space="preserve">full </w:t>
       </w:r>
       <w:proofErr w:type="spellStart"/>
       <w:r>
@@ -3476,18 +3473,13 @@
       </w:r>
       <w:proofErr w:type="spellEnd"/>
       <w:r>
-        <w:t xml:space="preserve"> tecnológica </w:t>
-      </w:r>
-      <w:r>
-        <w:t xml:space="preserve">full </w:t>
-      </w:r>
-      <w:proofErr w:type="spellStart"/>
-      <w:r>
-        <w:t>stack</w:t>
-      </w:r>
-      <w:proofErr w:type="spellEnd"/>
-      <w:r>
-        <w:t xml:space="preserve"> moderna e amplamente utilizada no mercado, compreendendo tecnologias de </w:t>
+        <w:t xml:space="preserve"> moderna e </w:t>
+      </w:r>
+      <w:r>
+        <w:t xml:space="preserve">principalmente porque é </w:t>
+      </w:r>
+      <w:r>
+        <w:t xml:space="preserve">amplamente utilizada no mercado, compreendendo tecnologias de </w:t>
       </w:r>
       <w:r>
         <w:t>f</w:t>
@@ -3575,13 +3567,7 @@
         <w:pStyle w:val="CorpodoTexto"/>
       </w:pPr>
       <w:r>
-        <w:t xml:space="preserve">O </w:t>
-      </w:r>
-      <w:r>
-        <w:t>f</w:t>
-      </w:r>
-      <w:r>
-        <w:t>ront-</w:t>
+        <w:t>A camada de front-</w:t>
       </w:r>
       <w:proofErr w:type="spellStart"/>
       <w:r>
@@ -3589,24 +3575,7 @@
       </w:r>
       <w:proofErr w:type="spellEnd"/>
       <w:r>
-        <w:t xml:space="preserve"> da aplicação, responsável pela interação direta com o usuário (cidadão e gestor), foi desenvolvido com </w:t>
-      </w:r>
-      <w:r>
-        <w:t>React.js</w:t>
-      </w:r>
-      <w:r>
-        <w:t xml:space="preserve"> e estilizado com </w:t>
-      </w:r>
-      <w:proofErr w:type="spellStart"/>
-      <w:r>
-        <w:t>Tailwind</w:t>
-      </w:r>
-      <w:proofErr w:type="spellEnd"/>
-      <w:r>
-        <w:t xml:space="preserve"> CSS</w:t>
-      </w:r>
-      <w:r>
-        <w:t>.</w:t>
+        <w:t xml:space="preserve"> foi concebida como o ponto de contato direto entre o sistema e seus usuários — cidadãos e gestores públicos. Por essa razão, priorizei tecnologias que proporcionassem organização estrutural do código, desempenho e adaptabilidade.</w:t>
       </w:r>
     </w:p>
     <w:p>
@@ -3637,10 +3606,7 @@
         <w:t xml:space="preserve">Justificativa: </w:t>
       </w:r>
       <w:r>
-        <w:t>React.js</w:t>
-      </w:r>
-      <w:r>
-        <w:t xml:space="preserve">, uma biblioteca </w:t>
+        <w:t xml:space="preserve">O React.js, biblioteca </w:t>
       </w:r>
       <w:proofErr w:type="spellStart"/>
       <w:r>
@@ -3648,43 +3614,16 @@
       </w:r>
       <w:proofErr w:type="spellEnd"/>
       <w:r>
-        <w:t xml:space="preserve"> desenvolvida pelo Facebook, foi escolhida por sua abordagem baseada em componentes, que promove a modularidade, reutilização de código e facilita a manutenção de interfaces complexas. Sua natureza declarativa simplifica o desenvolvimento de </w:t>
-      </w:r>
-      <w:proofErr w:type="spellStart"/>
-      <w:r>
-        <w:t>UIs</w:t>
-      </w:r>
-      <w:proofErr w:type="spellEnd"/>
-      <w:r>
-        <w:t xml:space="preserve"> interativas e eficientes, enquanto o conceito de Virtual DOM otimiza a atualização da interface, resultando em uma experiência de usuário fluida e responsiva </w:t>
-      </w:r>
-      <w:r>
-        <w:t>(</w:t>
-      </w:r>
-      <w:r>
-        <w:t>PORTO</w:t>
-      </w:r>
-      <w:r>
-        <w:t>, 20</w:t>
-      </w:r>
-      <w:r>
-        <w:t>24</w:t>
-      </w:r>
-      <w:r>
-        <w:t>)</w:t>
-      </w:r>
-      <w:r>
-        <w:t xml:space="preserve">. Além disso, a vasta comunidade e o ecossistema maduro do </w:t>
-      </w:r>
-      <w:r>
-        <w:rPr>
-          <w:i/>
-          <w:iCs/>
-        </w:rPr>
-        <w:t>React.js</w:t>
-      </w:r>
-      <w:r>
-        <w:t xml:space="preserve"> oferecem inúmeros recursos, bibliotecas e suporte, acelerando o processo de desenvolvimento.</w:t>
+        <w:t xml:space="preserve"> desenvolvida pelo Facebook, foi adotado por sua arquitetura baseada em componentes, que favorece modularidade e reaproveitamento de código, além de facilitar a manutenção evolutiva da aplicação (PORTO, 2024). Sua abordagem declarativa contribui para maior previsibilidade na construção das interfaces, enquanto o Virtual DOM otimiza a atualização de elementos na tela, melhorando a performance e a experiência do usuário.</w:t>
+      </w:r>
+    </w:p>
+    <w:p>
+      <w:pPr>
+        <w:pStyle w:val="CorpodoTexto"/>
+        <w:ind w:left="1429" w:firstLine="0"/>
+      </w:pPr>
+      <w:r>
+        <w:t>A escolha também se fundamenta na maturidade do ecossistema e na ampla documentação disponível, fatores relevantes quando se pensa em sustentabilidade tecnológica do projeto.</w:t>
       </w:r>
     </w:p>
     <w:p>
@@ -3696,37 +3635,19 @@
         </w:numPr>
       </w:pPr>
       <w:r>
-        <w:t xml:space="preserve">Aplicação: No </w:t>
+        <w:lastRenderedPageBreak/>
+        <w:t xml:space="preserve">Aplicação: </w:t>
+      </w:r>
+      <w:r>
+        <w:t xml:space="preserve">No sistema, o React.js estrutura todas as interfaces, desde autenticação até os painéis de acompanhamento de ocorrências. A </w:t>
       </w:r>
       <w:proofErr w:type="spellStart"/>
       <w:r>
-        <w:t>ReqCidadão</w:t>
+        <w:t>componentização</w:t>
       </w:r>
       <w:proofErr w:type="spellEnd"/>
       <w:r>
-        <w:t xml:space="preserve">, o </w:t>
-      </w:r>
-      <w:r>
-        <w:t>React.js</w:t>
-      </w:r>
-      <w:r>
-        <w:t xml:space="preserve"> é empregado na construção de todas as interfaces do usuário, desde as telas de </w:t>
-      </w:r>
-      <w:r>
-        <w:t>login</w:t>
-      </w:r>
-      <w:r>
-        <w:t xml:space="preserve"> e cadastro até os </w:t>
-      </w:r>
-      <w:r>
-        <w:t>dashboards</w:t>
-      </w:r>
-      <w:r>
-        <w:t xml:space="preserve"> de visualização e gerenciamento de ocorrências para cidadãos e gestores. A arquitetura de componentes permitiu criar </w:t>
-      </w:r>
-      <w:r>
-        <w:lastRenderedPageBreak/>
-        <w:t>elementos reutilizáveis para formulários de registro de ocorrências, listas de notificações, e painéis de controle, garantindo consistência visual e funcional em toda a aplicação.</w:t>
+        <w:t xml:space="preserve"> permitiu padronizar formulários, listas e painéis administrativos, garantindo uniformidade visual e facilitando futuras expansões da plataforma.</w:t>
       </w:r>
     </w:p>
     <w:p>
@@ -3760,7 +3681,10 @@
         </w:numPr>
       </w:pPr>
       <w:r>
-        <w:t xml:space="preserve">Justificativa: O </w:t>
+        <w:t xml:space="preserve">Justificativa: </w:t>
+      </w:r>
+      <w:r>
+        <w:t xml:space="preserve">O </w:t>
       </w:r>
       <w:proofErr w:type="spellStart"/>
       <w:r>
@@ -3768,23 +3692,7 @@
       </w:r>
       <w:proofErr w:type="spellEnd"/>
       <w:r>
-        <w:rPr>
-          <w:i/>
-          <w:iCs/>
-        </w:rPr>
-        <w:t xml:space="preserve"> </w:t>
-      </w:r>
-      <w:r>
-        <w:t>CSS</w:t>
-      </w:r>
-      <w:r>
-        <w:t xml:space="preserve"> é um </w:t>
-      </w:r>
-      <w:r>
-        <w:t>framework</w:t>
-      </w:r>
-      <w:r>
-        <w:t xml:space="preserve"> CSS </w:t>
+        <w:t xml:space="preserve"> CSS adota a abordagem </w:t>
       </w:r>
       <w:proofErr w:type="spellStart"/>
       <w:r>
@@ -3792,43 +3700,16 @@
       </w:r>
       <w:proofErr w:type="spellEnd"/>
       <w:r>
-        <w:t xml:space="preserve">, o que significa que ele oferece uma vasta gama de classes utilitárias de baixo nível diretamente no HTML/JSX para estilizar </w:t>
-      </w:r>
-      <w:r>
-        <w:t>elementos (</w:t>
-      </w:r>
-      <w:r>
-        <w:t>WATHAN, 2017</w:t>
-      </w:r>
-      <w:r>
-        <w:t>). Essa abordagem acelera significativamen</w:t>
-      </w:r>
-      <w:r>
-        <w:t xml:space="preserve">te o processo de </w:t>
-      </w:r>
-      <w:r>
-        <w:t>design</w:t>
-      </w:r>
-      <w:r>
-        <w:t xml:space="preserve"> e desenvolvimento, eliminando a necessidade de escrever CSS customizado para a maioria dos componentes. Ele também facilita a criação de </w:t>
-      </w:r>
-      <w:r>
-        <w:t>designs</w:t>
-      </w:r>
-      <w:r>
-        <w:t xml:space="preserve"> responsivos por padrão, com classes específicas para diferentes tamanhos de tela, garantindo que a aplicação se adapte perfeitamente a dispositivos móveis, </w:t>
-      </w:r>
-      <w:r>
-        <w:t xml:space="preserve">tablets e </w:t>
-      </w:r>
-      <w:r>
-        <w:t>desktops (</w:t>
-      </w:r>
-      <w:r>
-        <w:t>WATHAN</w:t>
-      </w:r>
-      <w:r>
-        <w:t>, 2017).</w:t>
+        <w:t>, disponibilizando classes utilitárias que permitem estilização direta nos componentes (WATHAN, 2017). Essa estratégia reduz a necessidade de folhas de estilo extensas e melhora a legibilidade estrutural do front-end.</w:t>
+      </w:r>
+    </w:p>
+    <w:p>
+      <w:pPr>
+        <w:pStyle w:val="CorpodoTexto"/>
+        <w:ind w:left="1429" w:firstLine="0"/>
+      </w:pPr>
+      <w:r>
+        <w:t>Além disso, seus recursos nativos de responsividade simplificam a adaptação da interface para diferentes dispositivos, o que é essencial em um sistema voltado ao cidadão, que frequentemente acessa serviços públicos por meio de dispositivos móveis (WATHAN, 2017).</w:t>
       </w:r>
     </w:p>
     <w:p>
@@ -3840,7 +3721,10 @@
         </w:numPr>
       </w:pPr>
       <w:r>
-        <w:t xml:space="preserve">Aplicação: No projeto, o </w:t>
+        <w:t xml:space="preserve">Aplicação: </w:t>
+      </w:r>
+      <w:r>
+        <w:t xml:space="preserve">O </w:t>
       </w:r>
       <w:proofErr w:type="spellStart"/>
       <w:r>
@@ -3848,19 +3732,7 @@
       </w:r>
       <w:proofErr w:type="spellEnd"/>
       <w:r>
-        <w:t xml:space="preserve"> CSS é utilizado para estilizar todos os componentes da interface do usuário do </w:t>
-      </w:r>
-      <w:r>
-        <w:t>React.js</w:t>
-      </w:r>
-      <w:r>
-        <w:t xml:space="preserve">. Ele garante a aplicação de um </w:t>
-      </w:r>
-      <w:r>
-        <w:t>design</w:t>
-      </w:r>
-      <w:r>
-        <w:t xml:space="preserve"> moderno, limpo e, crucialmente, assegura que o sistema seja totalmente responsivo, proporcionando uma experiência de uso otimizada para cidadãos e gestores que acessam a plataforma via navegador web em qualquer dispositivo.</w:t>
+        <w:t xml:space="preserve"> foi empregado na padronização visual da aplicação, assegurando layout limpo, coerente e responsivo. Essa escolha contribui para acessibilidade e usabilidade, aspectos que dialogam diretamente com o princípio da eficiência na administração pública.</w:t>
       </w:r>
     </w:p>
     <w:p>
@@ -3942,10 +3814,7 @@
         <w:t xml:space="preserve">Justificativa: </w:t>
       </w:r>
       <w:r>
-        <w:t>Node.js</w:t>
-      </w:r>
-      <w:r>
-        <w:t xml:space="preserve"> é um ambiente de execução </w:t>
+        <w:t xml:space="preserve">O Node.js é um ambiente de execução </w:t>
       </w:r>
       <w:proofErr w:type="spellStart"/>
       <w:r>
@@ -3953,100 +3822,33 @@
       </w:r>
       <w:proofErr w:type="spellEnd"/>
       <w:r>
-        <w:t xml:space="preserve"> </w:t>
+        <w:t xml:space="preserve"> orientado a eventos e não bloqueante, baseado no motor V8 do Google Chrome (DAHL, 2011). Sua arquitetura favorece aplicações com múltiplas conexões simultâneas, característica relevante em sistemas com potencial uso concorrente.</w:t>
+      </w:r>
+    </w:p>
+    <w:p>
+      <w:pPr>
+        <w:pStyle w:val="CorpodoTexto"/>
+        <w:ind w:left="1429" w:firstLine="0"/>
+      </w:pPr>
+      <w:r>
+        <w:lastRenderedPageBreak/>
+        <w:t xml:space="preserve">Outro fator determinante foi a possibilidade de utilizar </w:t>
       </w:r>
       <w:proofErr w:type="spellStart"/>
       <w:r>
-        <w:t>event-driven</w:t>
+        <w:t>JavaScript</w:t>
       </w:r>
       <w:proofErr w:type="spellEnd"/>
       <w:r>
-        <w:t xml:space="preserve"> e não</w:t>
-      </w:r>
-      <w:r>
-        <w:t xml:space="preserve"> </w:t>
-      </w:r>
-      <w:r>
-        <w:t xml:space="preserve">bloqueante construído sobre o motor V8 do </w:t>
-      </w:r>
-      <w:r>
-        <w:t>Google Chrome (DAHL, 201</w:t>
-      </w:r>
-      <w:r>
-        <w:t>1</w:t>
-      </w:r>
-      <w:r>
-        <w:t>)</w:t>
-      </w:r>
-      <w:r>
-        <w:t xml:space="preserve">. Sua escolha se justifica pela capacidade de lidar com um grande número de conexões simultâneas de forma eficiente, ideal para aplicações que exigem tempo real ou alta concorrência. Permite o uso </w:t>
-      </w:r>
-      <w:r>
-        <w:lastRenderedPageBreak/>
-        <w:t xml:space="preserve">de </w:t>
+        <w:t xml:space="preserve"> em toda a </w:t>
       </w:r>
       <w:proofErr w:type="spellStart"/>
       <w:r>
-        <w:t>JavaScript</w:t>
+        <w:t>stack</w:t>
       </w:r>
       <w:proofErr w:type="spellEnd"/>
       <w:r>
-        <w:t xml:space="preserve"> em toda a </w:t>
-      </w:r>
-      <w:proofErr w:type="spellStart"/>
-      <w:r>
-        <w:t>stack</w:t>
-      </w:r>
-      <w:proofErr w:type="spellEnd"/>
-      <w:r>
-        <w:t xml:space="preserve"> (</w:t>
-      </w:r>
-      <w:r>
-        <w:t xml:space="preserve">full </w:t>
-      </w:r>
-      <w:proofErr w:type="spellStart"/>
-      <w:r>
-        <w:t>stack</w:t>
-      </w:r>
-      <w:proofErr w:type="spellEnd"/>
-      <w:r>
-        <w:t xml:space="preserve"> </w:t>
-      </w:r>
-      <w:proofErr w:type="spellStart"/>
-      <w:r>
-        <w:t>JavaScript</w:t>
-      </w:r>
-      <w:proofErr w:type="spellEnd"/>
-      <w:r>
-        <w:t xml:space="preserve">), o que otimiza o aprendizado e a troca de contexto para o desenvolvedor. É altamente escalável e possui um ecossistema robusto de pacotes </w:t>
-      </w:r>
-      <w:r>
-        <w:t>(CANTELON</w:t>
-      </w:r>
-      <w:r>
-        <w:t xml:space="preserve">; HARTER; </w:t>
-      </w:r>
-      <w:r>
-        <w:t>HOLOWAYCHUK</w:t>
-      </w:r>
-      <w:r>
-        <w:t xml:space="preserve">; </w:t>
-      </w:r>
-      <w:r>
-        <w:t>RAJLICH</w:t>
-      </w:r>
-      <w:r>
-        <w:t>, 2013</w:t>
-      </w:r>
-      <w:r>
-        <w:rPr>
-          <w:i/>
-          <w:iCs/>
-        </w:rPr>
-        <w:t>)</w:t>
-      </w:r>
-      <w:r>
-        <w:t>.</w:t>
+        <w:t>, o que reduz complexidade estrutural e facilita manutenção. O amplo ecossistema de pacotes reforça sua viabilidade técnica (CANTELON; HARTER; HOLOWAYCHUK; RAJLICH, 2013).</w:t>
       </w:r>
     </w:p>
     <w:p>
@@ -4058,43 +3860,10 @@
         </w:numPr>
       </w:pPr>
       <w:r>
-        <w:t xml:space="preserve">Aplicação: O </w:t>
-      </w:r>
-      <w:r>
-        <w:t>Node.js</w:t>
-      </w:r>
-      <w:r>
-        <w:t xml:space="preserve"> serve como a base para o servidor da aplicação, executando toda a lógica de negócio do </w:t>
-      </w:r>
-      <w:proofErr w:type="spellStart"/>
-      <w:r>
-        <w:t>ReqCidadão</w:t>
-      </w:r>
-      <w:proofErr w:type="spellEnd"/>
-      <w:r>
-        <w:t xml:space="preserve">. Ele gerencia as requisições HTTP do </w:t>
-      </w:r>
-      <w:r>
-        <w:t>f</w:t>
-      </w:r>
-      <w:r>
-        <w:t>ront-</w:t>
-      </w:r>
-      <w:proofErr w:type="spellStart"/>
-      <w:r>
-        <w:t>end</w:t>
-      </w:r>
-      <w:proofErr w:type="spellEnd"/>
-      <w:r>
-        <w:t xml:space="preserve">, processa as operações de autenticação e autorização, e coordena a interação com o banco de dados </w:t>
-      </w:r>
-      <w:proofErr w:type="spellStart"/>
-      <w:r>
-        <w:t>Firebase</w:t>
-      </w:r>
-      <w:proofErr w:type="spellEnd"/>
-      <w:r>
-        <w:t xml:space="preserve"> para persistir e recuperar informações.</w:t>
+        <w:t xml:space="preserve">Aplicação: </w:t>
+      </w:r>
+      <w:r>
+        <w:t>No projeto, o Node.js executa a lógica de negócio, processa requisições HTTP, realiza validações e coordena a comunicação com o banco de dados. Ele centraliza as regras que disciplinam o fluxo das ocorrências registradas.</w:t>
       </w:r>
     </w:p>
     <w:p>
@@ -4122,7 +3891,10 @@
         </w:numPr>
       </w:pPr>
       <w:r>
-        <w:t xml:space="preserve">Justificativa: Express é um framework web minimalista e flexível para Node.js, amplamente utilizado para construir APIs </w:t>
+        <w:t xml:space="preserve">Justificativa: </w:t>
+      </w:r>
+      <w:r>
+        <w:t xml:space="preserve">O Express é um framework minimalista para Node.js amplamente utilizado na construção de APIs </w:t>
       </w:r>
       <w:proofErr w:type="spellStart"/>
       <w:r>
@@ -4130,24 +3902,16 @@
       </w:r>
       <w:proofErr w:type="spellEnd"/>
       <w:r>
-        <w:t xml:space="preserve"> e aplicações </w:t>
-      </w:r>
-      <w:r>
-        <w:t>web (TJ, [s.d.]). Sua</w:t>
-      </w:r>
-      <w:r>
-        <w:t xml:space="preserve"> leveza e extensibilidade permitem criar uma estrutura personalizada para o </w:t>
-      </w:r>
-      <w:proofErr w:type="spellStart"/>
-      <w:r>
-        <w:t>b</w:t>
-      </w:r>
-      <w:r>
-        <w:t>ack-end</w:t>
-      </w:r>
-      <w:proofErr w:type="spellEnd"/>
-      <w:r>
-        <w:t>, focando nas funcionalidades específicas do projeto sem a sobrecarga de frameworks mais opinativos. É conhecido por sua facilidade de uso e pela vasta quantidade de middlewares disponíveis para diversas funcionalidades.</w:t>
+        <w:t xml:space="preserve"> (TJ, [s.d.]). Sua leveza permite estruturar apenas os módulos necessários ao projeto, evitando complexidades desnecessárias.</w:t>
+      </w:r>
+    </w:p>
+    <w:p>
+      <w:pPr>
+        <w:pStyle w:val="CorpodoTexto"/>
+        <w:ind w:left="1429" w:firstLine="0"/>
+      </w:pPr>
+      <w:r>
+        <w:t>A clareza na definição de rotas e a possibilidade de utilização de middlewares contribuem para organização e segurança da aplicação.</w:t>
       </w:r>
     </w:p>
     <w:p>
@@ -4159,21 +3923,10 @@
         </w:numPr>
       </w:pPr>
       <w:r>
-        <w:t xml:space="preserve">Aplicação: O Express é utilizado para definir as rotas da API REST que o </w:t>
-      </w:r>
-      <w:r>
-        <w:t>f</w:t>
-      </w:r>
-      <w:r>
-        <w:t>ront-</w:t>
-      </w:r>
-      <w:proofErr w:type="spellStart"/>
-      <w:r>
-        <w:t>end</w:t>
-      </w:r>
-      <w:proofErr w:type="spellEnd"/>
-      <w:r>
-        <w:t xml:space="preserve"> consome. Ele trata as requisições HTTP para operações como registro e atualização de ocorrências, cadastro de usuários, gestão de entes federados e unidades gestoras, e todas as interações necessárias para o funcionamento do sistema.</w:t>
+        <w:t xml:space="preserve">Aplicação: </w:t>
+      </w:r>
+      <w:r>
+        <w:t>Foi utilizado na definição das rotas responsáveis pelo cadastro de usuários, registro de ocorrências, atualização de status e gestão administrativa. Também possibilita a aplicação de camadas de validação e controle de acesso.</w:t>
       </w:r>
     </w:p>
     <w:p>
@@ -4230,11 +3983,6 @@
       <w:r>
         <w:t>, foi selecionado.</w:t>
       </w:r>
-    </w:p>
-    <w:p>
-      <w:pPr>
-        <w:pStyle w:val="CorpodoTexto"/>
-      </w:pPr>
     </w:p>
     <w:p>
       <w:pPr>
@@ -4245,10 +3993,10 @@
         </w:numPr>
       </w:pPr>
       <w:r>
-        <w:t xml:space="preserve">Justificativa: O </w:t>
-      </w:r>
-      <w:r>
-        <w:t xml:space="preserve">Google </w:t>
+        <w:t xml:space="preserve">Justificativa: </w:t>
+      </w:r>
+      <w:r>
+        <w:t xml:space="preserve">O Google </w:t>
       </w:r>
       <w:proofErr w:type="spellStart"/>
       <w:r>
@@ -4256,7 +4004,7 @@
       </w:r>
       <w:proofErr w:type="spellEnd"/>
       <w:r>
-        <w:t xml:space="preserve"> é uma plataforma de desenvolvimento de aplicativos que oferece uma variedade de serviços </w:t>
+        <w:t xml:space="preserve"> oferece serviços de </w:t>
       </w:r>
       <w:proofErr w:type="spellStart"/>
       <w:r>
@@ -4272,16 +4020,7 @@
       </w:r>
       <w:proofErr w:type="spellEnd"/>
       <w:r>
-        <w:t xml:space="preserve">), incluindo autenticação, armazenamento e banco de dados </w:t>
-      </w:r>
-      <w:r>
-        <w:t>(GOOGLE, [s.d.])</w:t>
-      </w:r>
-      <w:r>
-        <w:t xml:space="preserve">. A escolha do </w:t>
-      </w:r>
-      <w:r>
-        <w:t xml:space="preserve">Cloud </w:t>
+        <w:t xml:space="preserve">), incluindo banco de dados e autenticação (GOOGLE, [s.d.]). O Cloud </w:t>
       </w:r>
       <w:proofErr w:type="spellStart"/>
       <w:r>
@@ -4289,7 +4028,7 @@
       </w:r>
       <w:proofErr w:type="spellEnd"/>
       <w:r>
-        <w:t xml:space="preserve">, um banco de dados </w:t>
+        <w:t xml:space="preserve">, banco </w:t>
       </w:r>
       <w:proofErr w:type="spellStart"/>
       <w:r>
@@ -4297,25 +4036,16 @@
       </w:r>
       <w:proofErr w:type="spellEnd"/>
       <w:r>
-        <w:t xml:space="preserve"> orientado a documentos e otimizado para escalabilidade e desempenho em tempo real, justifica-se pela sua facilidade de </w:t>
-      </w:r>
-      <w:r>
-        <w:lastRenderedPageBreak/>
-        <w:t xml:space="preserve">integração, escalabilidade automática e recursos de sincronização de dados em tempo real, que são cruciais para um sistema onde as atualizações de ocorrências e respostas precisam ser rapidamente refletidas para os usuários </w:t>
-      </w:r>
-      <w:r>
-        <w:t>(GOOGLE, [</w:t>
-      </w:r>
-      <w:proofErr w:type="gramStart"/>
-      <w:r>
-        <w:t>s.d.]b</w:t>
-      </w:r>
-      <w:proofErr w:type="gramEnd"/>
-      <w:r>
-        <w:t>)</w:t>
-      </w:r>
-      <w:r>
-        <w:t xml:space="preserve">. A arquitetura </w:t>
+        <w:t xml:space="preserve"> orientado a documentos, apresenta sincronização em tempo real e escalabilidade automática (GOOGLE, [s.d.]b).</w:t>
+      </w:r>
+    </w:p>
+    <w:p>
+      <w:pPr>
+        <w:pStyle w:val="CorpodoTexto"/>
+        <w:ind w:left="1429" w:firstLine="0"/>
+      </w:pPr>
+      <w:r>
+        <w:t xml:space="preserve">Sua arquitetura </w:t>
       </w:r>
       <w:proofErr w:type="spellStart"/>
       <w:r>
@@ -4323,15 +4053,7 @@
       </w:r>
       <w:proofErr w:type="spellEnd"/>
       <w:r>
-        <w:t xml:space="preserve"> do </w:t>
-      </w:r>
-      <w:proofErr w:type="spellStart"/>
-      <w:r>
-        <w:t>Firebase</w:t>
-      </w:r>
-      <w:proofErr w:type="spellEnd"/>
-      <w:r>
-        <w:t xml:space="preserve"> também simplifica a gestão da infraestrutura, permitindo que o foco seja totalmente no desenvolvimento da aplicação.</w:t>
+        <w:t xml:space="preserve"> reduz a necessidade de gerenciamento de infraestrutura, permitindo concentrar esforços na lógica da aplicação.</w:t>
       </w:r>
     </w:p>
     <w:p>
@@ -4343,7 +4065,10 @@
         </w:numPr>
       </w:pPr>
       <w:r>
-        <w:t xml:space="preserve">Aplicação: O </w:t>
+        <w:t xml:space="preserve">Aplicação: </w:t>
+      </w:r>
+      <w:r>
+        <w:t xml:space="preserve">O </w:t>
       </w:r>
       <w:proofErr w:type="spellStart"/>
       <w:r>
@@ -4351,7 +4076,11 @@
       </w:r>
       <w:proofErr w:type="spellEnd"/>
       <w:r>
-        <w:t xml:space="preserve"> armazena todos os dados do sistema, incluindo informações de cidadãos e gestores, detalhes de ocorrências (descrição, localização, tipo, status, mídias anexadas), histórico de interações, dados de entes federados e unidades gestoras. Sua capacidade de sincronização em tempo real facilita a notificação de atualizações e o acompanhamento do status das ocorrências por cidadãos e gestores.</w:t>
+        <w:t xml:space="preserve"> armazena dados de usuários, registros de ocorrências, histórico de interações e informações institucionais. A </w:t>
+      </w:r>
+      <w:r>
+        <w:lastRenderedPageBreak/>
+        <w:t>sincronização em tempo real permite atualização quase imediata do status das demandas.</w:t>
       </w:r>
     </w:p>
     <w:p>
@@ -4364,31 +4093,39 @@
         <w:pStyle w:val="Ttulo3"/>
         <w:ind w:left="1701" w:hanging="709"/>
       </w:pPr>
-      <w:bookmarkStart w:id="17" w:name="_Toc222648866"/>
-      <w:r>
-        <w:t>ORM (</w:t>
+      <w:r>
+        <w:t xml:space="preserve">Sobre o uso de ORM no contexto do </w:t>
       </w:r>
       <w:proofErr w:type="spellStart"/>
       <w:r>
-        <w:t>Object-Relational</w:t>
+        <w:t>Firestore</w:t>
       </w:r>
       <w:proofErr w:type="spellEnd"/>
-      <w:r>
-        <w:t xml:space="preserve"> </w:t>
+    </w:p>
+    <w:p>
+      <w:pPr>
+        <w:pStyle w:val="CorpodoTexto"/>
+        <w:ind w:firstLine="993"/>
+      </w:pPr>
+      <w:r>
+        <w:t xml:space="preserve">Diferentemente de bancos relacionais, o </w:t>
       </w:r>
       <w:proofErr w:type="spellStart"/>
       <w:r>
-        <w:t>Mapper</w:t>
+        <w:t>Firestore</w:t>
       </w:r>
       <w:proofErr w:type="spellEnd"/>
       <w:r>
-        <w:t xml:space="preserve">) no </w:t>
-      </w:r>
-      <w:r>
-        <w:t>c</w:t>
-      </w:r>
-      <w:r>
-        <w:t xml:space="preserve">ontexto do </w:t>
+        <w:t xml:space="preserve"> não opera sob paradigma relacional tradicional, razão pela qual o conceito clássico de ORM não se aplica diretamente.</w:t>
+      </w:r>
+    </w:p>
+    <w:p>
+      <w:pPr>
+        <w:pStyle w:val="CorpodoTexto"/>
+        <w:ind w:firstLine="993"/>
+      </w:pPr>
+      <w:r>
+        <w:t xml:space="preserve">A interação ocorre por meio do </w:t>
       </w:r>
       <w:proofErr w:type="spellStart"/>
       <w:r>
@@ -4396,151 +4133,24 @@
       </w:r>
       <w:proofErr w:type="spellEnd"/>
       <w:r>
-        <w:t>:</w:t>
-      </w:r>
-      <w:bookmarkEnd w:id="17"/>
-    </w:p>
-    <w:p>
-      <w:pPr>
-        <w:pStyle w:val="CorpodoTexto"/>
-      </w:pPr>
-      <w:r>
-        <w:t xml:space="preserve">É importante ressaltar que o conceito de ORM, tradicionalmente aplicado a bancos de dados relacionais para mapear objetos de código a tabelas de banco de dados, não se aplica diretamente ao </w:t>
-      </w:r>
-      <w:r>
-        <w:t xml:space="preserve">Cloud </w:t>
+        <w:t xml:space="preserve"> SDK para Node.js, que disponibiliza métodos para operações CRUD (GOOGLE, [s.d.]a).</w:t>
+      </w:r>
+    </w:p>
+    <w:p>
+      <w:pPr>
+        <w:pStyle w:val="CorpodoTexto"/>
+        <w:ind w:firstLine="993"/>
+      </w:pPr>
+      <w:r>
+        <w:t xml:space="preserve">Para organização do código, foram estruturadas camadas de acesso a dados (Data Access </w:t>
       </w:r>
       <w:proofErr w:type="spellStart"/>
       <w:r>
-        <w:t>Firestore</w:t>
+        <w:t>Layers</w:t>
       </w:r>
       <w:proofErr w:type="spellEnd"/>
       <w:r>
-        <w:t xml:space="preserve">, que é um banco de dados </w:t>
-      </w:r>
-      <w:proofErr w:type="spellStart"/>
-      <w:r>
-        <w:t>NoSQL</w:t>
-      </w:r>
-      <w:proofErr w:type="spellEnd"/>
-      <w:r>
-        <w:t xml:space="preserve"> orientado a documentos.</w:t>
-      </w:r>
-    </w:p>
-    <w:p>
-      <w:pPr>
-        <w:pStyle w:val="CorpodoTexto"/>
-      </w:pPr>
-      <w:r>
-        <w:t xml:space="preserve">Em vez de um ORM, a interação com o </w:t>
-      </w:r>
-      <w:proofErr w:type="spellStart"/>
-      <w:r>
-        <w:t>Firestore</w:t>
-      </w:r>
-      <w:proofErr w:type="spellEnd"/>
-      <w:r>
-        <w:t xml:space="preserve"> é realizada diretamente através do </w:t>
-      </w:r>
-      <w:proofErr w:type="spellStart"/>
-      <w:r>
-        <w:t>Firebase</w:t>
-      </w:r>
-      <w:proofErr w:type="spellEnd"/>
-      <w:r>
-        <w:t xml:space="preserve"> SDK (Software </w:t>
-      </w:r>
-      <w:proofErr w:type="spellStart"/>
-      <w:r>
-        <w:t>Development</w:t>
-      </w:r>
-      <w:proofErr w:type="spellEnd"/>
-      <w:r>
-        <w:t xml:space="preserve"> Kit) para Node.js</w:t>
-      </w:r>
-      <w:r>
-        <w:t>. Este SDK fornece métodos e interfaces que permitem realizar operações de CRUD (</w:t>
-      </w:r>
-      <w:proofErr w:type="spellStart"/>
-      <w:r>
-        <w:t>Create</w:t>
-      </w:r>
-      <w:proofErr w:type="spellEnd"/>
-      <w:r>
-        <w:t xml:space="preserve">, </w:t>
-      </w:r>
-      <w:proofErr w:type="spellStart"/>
-      <w:r>
-        <w:t>Read</w:t>
-      </w:r>
-      <w:proofErr w:type="spellEnd"/>
-      <w:r>
-        <w:t xml:space="preserve">, Update, Delete) em coleções e documentos de forma programática, abstraindo as complexidades da comunicação com o banco de dados </w:t>
-      </w:r>
-      <w:r>
-        <w:t>(GOOGLE, [</w:t>
-      </w:r>
-      <w:proofErr w:type="gramStart"/>
-      <w:r>
-        <w:t>s.d.]a</w:t>
-      </w:r>
-      <w:proofErr w:type="gramEnd"/>
-      <w:r>
-        <w:t>)</w:t>
-      </w:r>
-      <w:r>
-        <w:t>.</w:t>
-      </w:r>
-    </w:p>
-    <w:p>
-      <w:pPr>
-        <w:pStyle w:val="CorpodoTexto"/>
-      </w:pPr>
-      <w:r>
-        <w:t>Para manter a organização e facilitar a manutenção do código, são utilizadas camadas de acesso a dados (</w:t>
-      </w:r>
-      <w:r>
-        <w:t xml:space="preserve">Data Access </w:t>
-      </w:r>
-      <w:proofErr w:type="spellStart"/>
-      <w:r>
-        <w:t>Layers</w:t>
-      </w:r>
-      <w:proofErr w:type="spellEnd"/>
-      <w:r>
-        <w:t xml:space="preserve">) ou padrões de repositório, que encapsulam a lógica de interação com o SDK do </w:t>
-      </w:r>
-      <w:proofErr w:type="spellStart"/>
-      <w:r>
-        <w:t>Firebase</w:t>
-      </w:r>
-      <w:proofErr w:type="spellEnd"/>
-      <w:r>
-        <w:t xml:space="preserve">. Essas camadas definem modelos de dados (interfaces ou classes em </w:t>
-      </w:r>
-      <w:proofErr w:type="spellStart"/>
-      <w:r>
-        <w:t>TypeScript</w:t>
-      </w:r>
-      <w:proofErr w:type="spellEnd"/>
-      <w:r>
-        <w:t>/</w:t>
-      </w:r>
-      <w:proofErr w:type="spellStart"/>
-      <w:r>
-        <w:t>JavaScript</w:t>
-      </w:r>
-      <w:proofErr w:type="spellEnd"/>
-      <w:r>
-        <w:t xml:space="preserve">) que representam a estrutura dos documentos armazenados no </w:t>
-      </w:r>
-      <w:proofErr w:type="spellStart"/>
-      <w:r>
-        <w:t>Firestore</w:t>
-      </w:r>
-      <w:proofErr w:type="spellEnd"/>
-      <w:r>
-        <w:t>, garantindo consistência e tipagem forte no manuseio dos dados dentro da aplicação.</w:t>
+        <w:t>), que centralizam a comunicação com o banco e padronizam os modelos utilizados na aplicação, garantindo consistência e previsibilidade.</w:t>
       </w:r>
     </w:p>
     <w:p>
@@ -4549,18 +4159,18 @@
         <w:spacing w:before="240"/>
         <w:ind w:left="1145"/>
       </w:pPr>
-      <w:bookmarkStart w:id="18" w:name="_Toc222648867"/>
+      <w:bookmarkStart w:id="17" w:name="_Toc222648867"/>
       <w:r>
         <w:t>Autenticação: JSON Web Tokens (JWT)</w:t>
       </w:r>
-      <w:bookmarkEnd w:id="18"/>
-    </w:p>
-    <w:p>
-      <w:pPr>
-        <w:pStyle w:val="CorpodoTexto"/>
-      </w:pPr>
-      <w:r>
-        <w:t>A segurança e a integridade do acesso ao sistema são garantidas por um robusto mecanismo de autenticação.</w:t>
+      <w:bookmarkEnd w:id="17"/>
+    </w:p>
+    <w:p>
+      <w:pPr>
+        <w:pStyle w:val="CorpodoTexto"/>
+      </w:pPr>
+      <w:r>
+        <w:t>A segurança do sistema foi tratada como requisito essencial.</w:t>
       </w:r>
     </w:p>
     <w:p>
@@ -4572,79 +4182,27 @@
         </w:numPr>
       </w:pPr>
       <w:r>
-        <w:lastRenderedPageBreak/>
-        <w:t xml:space="preserve">Justificativa: JSON </w:t>
-      </w:r>
-      <w:r>
-        <w:rPr>
-          <w:i/>
-          <w:iCs/>
-        </w:rPr>
-        <w:t>Web Tokens</w:t>
-      </w:r>
-      <w:r>
-        <w:t xml:space="preserve"> (JWT) é um padrão aberto para a criação de </w:t>
-      </w:r>
-      <w:r>
-        <w:rPr>
-          <w:i/>
-          <w:iCs/>
-        </w:rPr>
-        <w:t>tokens</w:t>
-      </w:r>
-      <w:r>
-        <w:t xml:space="preserve"> de acesso que permitem a troca segura de informações entre </w:t>
-      </w:r>
-      <w:r>
-        <w:t>partes (</w:t>
-      </w:r>
-      <w:r>
-        <w:t>BATTISTI</w:t>
-      </w:r>
-      <w:r>
-        <w:t>, 20</w:t>
-      </w:r>
-      <w:r>
-        <w:t>21</w:t>
-      </w:r>
-      <w:r>
-        <w:t>). Sua</w:t>
-      </w:r>
-      <w:r>
-        <w:t xml:space="preserve"> natureza </w:t>
+        <w:t xml:space="preserve">Justificativa: </w:t>
+      </w:r>
+      <w:r>
+        <w:t xml:space="preserve">O JWT é um padrão aberto para criação de tokens de acesso que permitem a troca segura de informações entre partes (BATTISTI, 2021). Seu modelo </w:t>
       </w:r>
       <w:proofErr w:type="spellStart"/>
       <w:r>
-        <w:rPr>
-          <w:i/>
-          <w:iCs/>
-        </w:rPr>
         <w:t>stateless</w:t>
       </w:r>
       <w:proofErr w:type="spellEnd"/>
       <w:r>
-        <w:t xml:space="preserve"> (sem estado) é ideal para APIs </w:t>
-      </w:r>
-      <w:proofErr w:type="spellStart"/>
-      <w:r>
-        <w:t>RESTful</w:t>
-      </w:r>
-      <w:proofErr w:type="spellEnd"/>
-      <w:r>
-        <w:t xml:space="preserve">, pois o servidor não precisa armazenar informações de sessão, tornando a autenticação escalável e eficiente. Os </w:t>
-      </w:r>
-      <w:r>
-        <w:rPr>
-          <w:i/>
-          <w:iCs/>
-        </w:rPr>
-        <w:t>tokens</w:t>
-      </w:r>
-      <w:r>
-        <w:t xml:space="preserve"> são assinados digitalmente, garantindo sua integridade e autenticidade</w:t>
-      </w:r>
-      <w:r>
-        <w:t xml:space="preserve"> (IETF, 2015).</w:t>
+        <w:t xml:space="preserve"> favorece APIs REST, eliminando a necessidade de controle de sessão no servidor.</w:t>
+      </w:r>
+    </w:p>
+    <w:p>
+      <w:pPr>
+        <w:pStyle w:val="CorpodoTexto"/>
+        <w:ind w:left="1429" w:firstLine="0"/>
+      </w:pPr>
+      <w:r>
+        <w:t>Os tokens são assinados digitalmente, assegurando integridade e autenticidade das informações (IETF, 2015).</w:t>
       </w:r>
     </w:p>
     <w:p>
@@ -4656,190 +4214,18 @@
         </w:numPr>
       </w:pPr>
       <w:r>
-        <w:t xml:space="preserve">Aplicação: Após o processo de login (que pode ser integrado com o serviço de autenticação do </w:t>
+        <w:t xml:space="preserve">Aplicação: </w:t>
+      </w:r>
+      <w:r>
+        <w:t xml:space="preserve">Após autenticação, o servidor gera um token JWT, que é enviado ao cliente e utilizado nas requisições subsequentes. O </w:t>
       </w:r>
       <w:proofErr w:type="spellStart"/>
       <w:r>
-        <w:rPr>
-          <w:i/>
-          <w:iCs/>
-        </w:rPr>
-        <w:t>Firebase</w:t>
+        <w:t>back-end</w:t>
       </w:r>
       <w:proofErr w:type="spellEnd"/>
       <w:r>
-        <w:t xml:space="preserve"> ou um sistema de autenticação próprio no </w:t>
-      </w:r>
-      <w:r>
-        <w:rPr>
-          <w:i/>
-          <w:iCs/>
-        </w:rPr>
-        <w:t>Back-</w:t>
-      </w:r>
-      <w:proofErr w:type="spellStart"/>
-      <w:r>
-        <w:rPr>
-          <w:i/>
-          <w:iCs/>
-        </w:rPr>
-        <w:t>end</w:t>
-      </w:r>
-      <w:proofErr w:type="spellEnd"/>
-      <w:r>
-        <w:t xml:space="preserve">), o servidor </w:t>
-      </w:r>
-      <w:r>
-        <w:rPr>
-          <w:i/>
-          <w:iCs/>
-        </w:rPr>
-        <w:t>Node.js</w:t>
-      </w:r>
-      <w:r>
-        <w:t>/</w:t>
-      </w:r>
-      <w:r>
-        <w:rPr>
-          <w:i/>
-          <w:iCs/>
-        </w:rPr>
-        <w:t>Express</w:t>
-      </w:r>
-      <w:r>
-        <w:t xml:space="preserve"> gera um JWT. Este </w:t>
-      </w:r>
-      <w:r>
-        <w:rPr>
-          <w:i/>
-          <w:iCs/>
-        </w:rPr>
-        <w:t>token</w:t>
-      </w:r>
-      <w:r>
-        <w:t xml:space="preserve"> é então enviado ao </w:t>
-      </w:r>
-      <w:r>
-        <w:rPr>
-          <w:i/>
-          <w:iCs/>
-        </w:rPr>
-        <w:t>Front-</w:t>
-      </w:r>
-      <w:proofErr w:type="spellStart"/>
-      <w:r>
-        <w:rPr>
-          <w:i/>
-          <w:iCs/>
-        </w:rPr>
-        <w:t>end</w:t>
-      </w:r>
-      <w:proofErr w:type="spellEnd"/>
-      <w:r>
-        <w:t xml:space="preserve"> e armazenado de forma segura (por exemplo, em </w:t>
-      </w:r>
-      <w:proofErr w:type="spellStart"/>
-      <w:r>
-        <w:rPr>
-          <w:i/>
-          <w:iCs/>
-        </w:rPr>
-        <w:t>localStorage</w:t>
-      </w:r>
-      <w:proofErr w:type="spellEnd"/>
-      <w:r>
-        <w:t xml:space="preserve"> ou </w:t>
-      </w:r>
-      <w:proofErr w:type="spellStart"/>
-      <w:r>
-        <w:rPr>
-          <w:i/>
-          <w:iCs/>
-        </w:rPr>
-        <w:t>sessionStorage</w:t>
-      </w:r>
-      <w:proofErr w:type="spellEnd"/>
-      <w:r>
-        <w:t xml:space="preserve">). Em todas as requisições subsequentes do </w:t>
-      </w:r>
-      <w:r>
-        <w:rPr>
-          <w:i/>
-          <w:iCs/>
-        </w:rPr>
-        <w:t>Front-</w:t>
-      </w:r>
-      <w:proofErr w:type="spellStart"/>
-      <w:r>
-        <w:rPr>
-          <w:i/>
-          <w:iCs/>
-        </w:rPr>
-        <w:t>end</w:t>
-      </w:r>
-      <w:proofErr w:type="spellEnd"/>
-      <w:r>
-        <w:t xml:space="preserve"> para o </w:t>
-      </w:r>
-      <w:r>
-        <w:rPr>
-          <w:i/>
-          <w:iCs/>
-        </w:rPr>
-        <w:t>Back-</w:t>
-      </w:r>
-      <w:proofErr w:type="spellStart"/>
-      <w:r>
-        <w:rPr>
-          <w:i/>
-          <w:iCs/>
-        </w:rPr>
-        <w:t>end</w:t>
-      </w:r>
-      <w:proofErr w:type="spellEnd"/>
-      <w:r>
-        <w:t xml:space="preserve"> que exigem autenticação, o JWT é enviado no cabeçalho </w:t>
-      </w:r>
-      <w:proofErr w:type="spellStart"/>
-      <w:r>
-        <w:rPr>
-          <w:i/>
-          <w:iCs/>
-        </w:rPr>
-        <w:t>Authorization</w:t>
-      </w:r>
-      <w:proofErr w:type="spellEnd"/>
-      <w:r>
-        <w:t xml:space="preserve">. O </w:t>
-      </w:r>
-      <w:r>
-        <w:rPr>
-          <w:i/>
-          <w:iCs/>
-        </w:rPr>
-        <w:t>Back-</w:t>
-      </w:r>
-      <w:proofErr w:type="spellStart"/>
-      <w:r>
-        <w:rPr>
-          <w:i/>
-          <w:iCs/>
-        </w:rPr>
-        <w:t>end</w:t>
-      </w:r>
-      <w:proofErr w:type="spellEnd"/>
-      <w:r>
-        <w:t xml:space="preserve"> valida o </w:t>
-      </w:r>
-      <w:r>
-        <w:rPr>
-          <w:i/>
-          <w:iCs/>
-        </w:rPr>
-        <w:t>token</w:t>
-      </w:r>
-      <w:r>
-        <w:t xml:space="preserve"> para verificar a identidade e as permissões do usuário, controlando o acesso a funcionalidades específicas do cidadão ou do gestor.</w:t>
+        <w:t xml:space="preserve"> valida o token antes de permitir acesso a funcionalidades específicas, aplicando controle de permissões conforme o perfil do usuário.</w:t>
       </w:r>
     </w:p>
     <w:p>
@@ -4848,7 +4234,7 @@
         <w:spacing w:before="240"/>
         <w:ind w:left="1145"/>
       </w:pPr>
-      <w:bookmarkStart w:id="19" w:name="_Toc222648868"/>
+      <w:bookmarkStart w:id="18" w:name="_Toc222648868"/>
       <w:r>
         <w:t xml:space="preserve">Ferramentas de Desenvolvimento: </w:t>
       </w:r>
@@ -4860,22 +4246,14 @@
       <w:r>
         <w:t>/GitHub e Docker</w:t>
       </w:r>
-      <w:bookmarkEnd w:id="19"/>
-    </w:p>
-    <w:p>
-      <w:pPr>
-        <w:pStyle w:val="CorpodoTexto"/>
-      </w:pPr>
-      <w:r>
-        <w:t xml:space="preserve">Para garantir a eficiência no desenvolvimento, colaboração e padronização do ambiente, ferramentas modernas de gerenciamento de código e </w:t>
-      </w:r>
-      <w:proofErr w:type="spellStart"/>
-      <w:r>
-        <w:t>containerização</w:t>
-      </w:r>
-      <w:proofErr w:type="spellEnd"/>
-      <w:r>
-        <w:t xml:space="preserve"> são indispensáveis.</w:t>
+      <w:bookmarkEnd w:id="18"/>
+    </w:p>
+    <w:p>
+      <w:pPr>
+        <w:pStyle w:val="CorpodoTexto"/>
+      </w:pPr>
+      <w:r>
+        <w:t>A organização do desenvolvimento também foi considerada parte integrante da qualidade do projeto.</w:t>
       </w:r>
     </w:p>
     <w:p>
@@ -4888,7 +4266,7 @@
         <w:pStyle w:val="Ttulo3"/>
         <w:ind w:left="1701" w:hanging="709"/>
       </w:pPr>
-      <w:bookmarkStart w:id="20" w:name="_Toc222648869"/>
+      <w:bookmarkStart w:id="19" w:name="_Toc222648869"/>
       <w:proofErr w:type="spellStart"/>
       <w:r>
         <w:t>Git</w:t>
@@ -4897,7 +4275,7 @@
       <w:r>
         <w:t xml:space="preserve"> e GitHub:</w:t>
       </w:r>
-      <w:bookmarkEnd w:id="20"/>
+      <w:bookmarkEnd w:id="19"/>
     </w:p>
     <w:p>
       <w:pPr>
@@ -4920,7 +4298,11 @@
       </w:r>
       <w:proofErr w:type="spellEnd"/>
       <w:r>
-        <w:t xml:space="preserve"> é um sistema de controle de versão distribuído que permite rastrear mudanças no código-fonte, reverter para versões anteriores e gerenciar o desenvolvimento </w:t>
+        <w:t xml:space="preserve"> é um sistema de controle de versão distribuído que permite rastrear mudanças no código-fonte, reverter para versões </w:t>
+      </w:r>
+      <w:r>
+        <w:lastRenderedPageBreak/>
+        <w:t xml:space="preserve">anteriores e gerenciar o desenvolvimento </w:t>
       </w:r>
       <w:r>
         <w:t>colaborativo (CHACON; STRAUB, 2014).</w:t>
@@ -4974,96 +4356,26 @@
         </w:numPr>
       </w:pPr>
       <w:r>
-        <w:lastRenderedPageBreak/>
-        <w:t xml:space="preserve">Aplicação: Todos os códigos-fonte do </w:t>
-      </w:r>
-      <w:r>
-        <w:rPr>
-          <w:i/>
-          <w:iCs/>
-        </w:rPr>
-        <w:t>Front-</w:t>
+        <w:t xml:space="preserve">Aplicação: </w:t>
+      </w:r>
+      <w:r>
+        <w:t xml:space="preserve">Todo o código do sistema foi </w:t>
       </w:r>
       <w:proofErr w:type="spellStart"/>
       <w:r>
-        <w:rPr>
-          <w:i/>
-          <w:iCs/>
-        </w:rPr>
-        <w:t>end</w:t>
+        <w:t>versionado</w:t>
       </w:r>
       <w:proofErr w:type="spellEnd"/>
       <w:r>
-        <w:t xml:space="preserve"> e do </w:t>
-      </w:r>
-      <w:r>
-        <w:rPr>
-          <w:i/>
-          <w:iCs/>
-        </w:rPr>
-        <w:t>Back-</w:t>
+        <w:t xml:space="preserve"> e mantido em repositórios privados, permitindo organização por </w:t>
       </w:r>
       <w:proofErr w:type="spellStart"/>
       <w:r>
-        <w:rPr>
-          <w:i/>
-          <w:iCs/>
-        </w:rPr>
-        <w:t>end</w:t>
+        <w:t>branches</w:t>
       </w:r>
       <w:proofErr w:type="spellEnd"/>
       <w:r>
-        <w:t xml:space="preserve"> do </w:t>
-      </w:r>
-      <w:proofErr w:type="spellStart"/>
-      <w:r>
-        <w:t>ReqCidadão</w:t>
-      </w:r>
-      <w:proofErr w:type="spellEnd"/>
-      <w:r>
-        <w:t xml:space="preserve"> são </w:t>
-      </w:r>
-      <w:proofErr w:type="spellStart"/>
-      <w:r>
-        <w:t>versionados</w:t>
-      </w:r>
-      <w:proofErr w:type="spellEnd"/>
-      <w:r>
-        <w:t xml:space="preserve"> utilizando </w:t>
-      </w:r>
-      <w:proofErr w:type="spellStart"/>
-      <w:r>
-        <w:rPr>
-          <w:i/>
-          <w:iCs/>
-        </w:rPr>
-        <w:t>Git</w:t>
-      </w:r>
-      <w:proofErr w:type="spellEnd"/>
-      <w:r>
-        <w:t xml:space="preserve"> e hospedados em repositórios privados no </w:t>
-      </w:r>
-      <w:r>
-        <w:rPr>
-          <w:i/>
-          <w:iCs/>
-        </w:rPr>
-        <w:t>GitHub</w:t>
-      </w:r>
-      <w:r>
-        <w:t xml:space="preserve">. Isso permite um controle rigoroso das alterações, a criação de </w:t>
-      </w:r>
-      <w:proofErr w:type="spellStart"/>
-      <w:r>
-        <w:rPr>
-          <w:i/>
-          <w:iCs/>
-        </w:rPr>
-        <w:t>branches</w:t>
-      </w:r>
-      <w:proofErr w:type="spellEnd"/>
-      <w:r>
-        <w:t xml:space="preserve"> para desenvolvimento de funcionalidades específicas e a facilidade de implantação em ambientes de nuvem.</w:t>
+        <w:t xml:space="preserve"> e controle estruturado de alterações.</w:t>
       </w:r>
     </w:p>
     <w:p>
@@ -5086,47 +4398,7 @@
         <w:t xml:space="preserve">Justificativa: </w:t>
       </w:r>
       <w:r>
-        <w:rPr>
-          <w:i/>
-          <w:iCs/>
-        </w:rPr>
-        <w:t>Docker</w:t>
-      </w:r>
-      <w:r>
-        <w:t xml:space="preserve"> é uma plataforma que permite aos desenvolvedores empacotar aplicações e suas dependências em contêineres (</w:t>
-      </w:r>
-      <w:r>
-        <w:rPr>
-          <w:highlight w:val="yellow"/>
-        </w:rPr>
-        <w:t>DOCKER, [s.d.]</w:t>
-      </w:r>
-      <w:r>
-        <w:t xml:space="preserve">). Contêineres são leves, portáteis e isolados, garantindo que a aplicação funcione de forma consistente em qualquer ambiente (desenvolvimento, teste, produção). Isso resolve o problema comum </w:t>
-      </w:r>
-      <w:r>
-        <w:t xml:space="preserve">reportado por desenvolvedores </w:t>
-      </w:r>
-      <w:r>
-        <w:t xml:space="preserve">de </w:t>
-      </w:r>
-      <w:r>
-        <w:t xml:space="preserve">que </w:t>
-      </w:r>
-      <w:r>
-        <w:t xml:space="preserve">"funciona na minha máquina", padronizando o ambiente de execução e simplificando o processo de </w:t>
-      </w:r>
-      <w:proofErr w:type="spellStart"/>
-      <w:r>
-        <w:rPr>
-          <w:i/>
-          <w:iCs/>
-        </w:rPr>
-        <w:t>deploy</w:t>
-      </w:r>
-      <w:proofErr w:type="spellEnd"/>
-      <w:r>
-        <w:t xml:space="preserve"> e testes.</w:t>
+        <w:t>O Docker possibilita empacotar aplicações em contêineres isolados, garantindo consistência entre ambientes (DOCKER, [s.d.]). Isso reduz divergências entre desenvolvimento e produção.</w:t>
       </w:r>
     </w:p>
     <w:p>
@@ -5138,141 +4410,18 @@
         </w:numPr>
       </w:pPr>
       <w:r>
-        <w:t xml:space="preserve">Aplicação: O Docker é utilizado para </w:t>
+        <w:t xml:space="preserve">Aplicação: </w:t>
+      </w:r>
+      <w:r>
+        <w:t xml:space="preserve">Foi utilizado para padronizar o ambiente do </w:t>
       </w:r>
       <w:proofErr w:type="spellStart"/>
       <w:r>
-        <w:t>containerizar</w:t>
+        <w:t>back-end</w:t>
       </w:r>
       <w:proofErr w:type="spellEnd"/>
       <w:r>
-        <w:t xml:space="preserve"> o ambiente de desenvolvimento e, potencialmente, o </w:t>
-      </w:r>
-      <w:proofErr w:type="spellStart"/>
-      <w:r>
-        <w:rPr>
-          <w:i/>
-          <w:iCs/>
-        </w:rPr>
-        <w:t>deploy</w:t>
-      </w:r>
-      <w:proofErr w:type="spellEnd"/>
-      <w:r>
-        <w:t xml:space="preserve"> do </w:t>
-      </w:r>
-      <w:r>
-        <w:rPr>
-          <w:i/>
-          <w:iCs/>
-        </w:rPr>
-        <w:t>Back-</w:t>
-      </w:r>
-      <w:proofErr w:type="spellStart"/>
-      <w:r>
-        <w:rPr>
-          <w:i/>
-          <w:iCs/>
-        </w:rPr>
-        <w:t>end</w:t>
-      </w:r>
-      <w:proofErr w:type="spellEnd"/>
-      <w:r>
-        <w:t xml:space="preserve"> (</w:t>
-      </w:r>
-      <w:r>
-        <w:rPr>
-          <w:i/>
-          <w:iCs/>
-        </w:rPr>
-        <w:t>Node.js</w:t>
-      </w:r>
-      <w:r>
-        <w:t>/</w:t>
-      </w:r>
-      <w:r>
-        <w:rPr>
-          <w:i/>
-          <w:iCs/>
-        </w:rPr>
-        <w:t>Express</w:t>
-      </w:r>
-      <w:r>
-        <w:t xml:space="preserve">). Embora o </w:t>
-      </w:r>
-      <w:proofErr w:type="spellStart"/>
-      <w:r>
-        <w:rPr>
-          <w:i/>
-          <w:iCs/>
-        </w:rPr>
-        <w:t>Firebase</w:t>
-      </w:r>
-      <w:proofErr w:type="spellEnd"/>
-      <w:r>
-        <w:t xml:space="preserve"> seja </w:t>
-      </w:r>
-      <w:proofErr w:type="spellStart"/>
-      <w:r>
-        <w:rPr>
-          <w:i/>
-          <w:iCs/>
-        </w:rPr>
-        <w:t>serverless</w:t>
-      </w:r>
-      <w:proofErr w:type="spellEnd"/>
-      <w:r>
-        <w:t xml:space="preserve"> e não necessite de </w:t>
-      </w:r>
-      <w:r>
-        <w:rPr>
-          <w:i/>
-          <w:iCs/>
-        </w:rPr>
-        <w:t>Docker</w:t>
-      </w:r>
-      <w:r>
-        <w:t xml:space="preserve"> para o banco de dados em produção, o uso de </w:t>
-      </w:r>
-      <w:r>
-        <w:rPr>
-          <w:i/>
-          <w:iCs/>
-        </w:rPr>
-        <w:t>Docker</w:t>
-      </w:r>
-      <w:r>
-        <w:t xml:space="preserve"> para o </w:t>
-      </w:r>
-      <w:r>
-        <w:rPr>
-          <w:i/>
-          <w:iCs/>
-        </w:rPr>
-        <w:t>Back-</w:t>
-      </w:r>
-      <w:proofErr w:type="spellStart"/>
-      <w:r>
-        <w:rPr>
-          <w:i/>
-          <w:iCs/>
-        </w:rPr>
-        <w:t>end</w:t>
-      </w:r>
-      <w:proofErr w:type="spellEnd"/>
-      <w:r>
-        <w:t xml:space="preserve"> assegura que todas as dependências e configurações do Node.js sejam consistentes entre as máquinas de desenvolvimento e os ambientes de </w:t>
-      </w:r>
-      <w:proofErr w:type="spellStart"/>
-      <w:r>
-        <w:rPr>
-          <w:i/>
-          <w:iCs/>
-        </w:rPr>
-        <w:t>staging</w:t>
-      </w:r>
-      <w:proofErr w:type="spellEnd"/>
-      <w:r>
-        <w:t>/produção, facilitando a replicação do ambiente e a escalabilidade futura.</w:t>
+        <w:t>, assegurando que dependências e configurações permaneçam idênticas em diferentes máquinas e ambientes de execução.</w:t>
       </w:r>
     </w:p>
     <w:p>
@@ -5349,12 +4498,12 @@
           </w14:textFill>
         </w:rPr>
       </w:pPr>
-      <w:bookmarkStart w:id="21" w:name="_Toc222648870"/>
+      <w:bookmarkStart w:id="20" w:name="_Toc222648870"/>
       <w:r>
         <w:lastRenderedPageBreak/>
         <w:t>Lições aprendidas durante a formação</w:t>
       </w:r>
-      <w:bookmarkEnd w:id="21"/>
+      <w:bookmarkEnd w:id="20"/>
     </w:p>
     <w:p>
       <w:pPr>
@@ -5641,12 +4790,12 @@
           </w14:textFill>
         </w:rPr>
       </w:pPr>
-      <w:bookmarkStart w:id="22" w:name="_Toc222648871"/>
+      <w:bookmarkStart w:id="21" w:name="_Toc222648871"/>
       <w:r>
         <w:lastRenderedPageBreak/>
         <w:t>Competências e expectativas</w:t>
       </w:r>
-      <w:bookmarkEnd w:id="22"/>
+      <w:bookmarkEnd w:id="21"/>
       <w:r>
         <w:t xml:space="preserve"> </w:t>
       </w:r>
@@ -5744,15 +4893,7 @@
         <w:pStyle w:val="CorpodoTexto"/>
       </w:pPr>
       <w:r>
-        <w:t xml:space="preserve">Ao iniciar a pós-graduação em Desenvolvimento Full Stack, confesso que me peguei pensando se realmente teria condições de finalizá-la. A verdade é que fazia muito tempo, décadas na verdade, desde o início dos anos 2000, que eu não atuava diretamente como desenvolvedor. O universo da programação mudou drasticamente nesse período; linguagens evoluíram, novas surgiram, e as arquiteturas de sistemas se transformaram de formas que </w:t>
-      </w:r>
-      <w:proofErr w:type="gramStart"/>
-      <w:r>
-        <w:t>eu, na minha atuação como gestor, apenas acompanhava</w:t>
-      </w:r>
-      <w:proofErr w:type="gramEnd"/>
-      <w:r>
-        <w:t xml:space="preserve"> de longe, conceitualmente. Havia um receio genuíno de que a distância entre o que eu sabia e o que era exigido hoje seria grande demais para ser superada em um curso de pós-graduação EAD, com todos os desafios de organização pessoal que mencionei anteriormente.</w:t>
+        <w:t>Ao iniciar a pós-graduação em Desenvolvimento Full Stack, confesso que me peguei pensando se realmente teria condições de finalizá-la. A verdade é que fazia muito tempo, décadas na verdade, desde o início dos anos 2000, que eu não atuava diretamente como desenvolvedor. O universo da programação mudou drasticamente nesse período; linguagens evoluíram, novas surgiram, e as arquiteturas de sistemas se transformaram de formas que eu, na minha atuação como gestor, apenas acompanhava de longe, conceitualmente. Havia um receio genuíno de que a distância entre o que eu sabia e o que era exigido hoje seria grande demais para ser superada em um curso de pós-graduação EAD, com todos os desafios de organização pessoal que mencionei anteriormente.</w:t>
       </w:r>
     </w:p>
     <w:p>
@@ -5829,21 +4970,7 @@
         <w:rPr>
           <w:highlight w:val="yellow"/>
         </w:rPr>
-        <w:t xml:space="preserve">Nesta seção, faça uma autoavaliação pessoal e técnica no decorrer do curso. Traga percepções de sentimentos (empolgação, maturidade, frustrações) com as quais conviveu até chegar neste ponto. Traga também suas percepções com relação a, por exemplo, satisfações ou frustrações de capacidades que alcançou ao longo da sua formação. Por exemplo, qual o primeiro momento em que se sentiu como um profissional capacitado a realizar as atividades esperadas de um egresso do curso, ou quando dedicou </w:t>
-      </w:r>
-      <w:proofErr w:type="gramStart"/>
-      <w:r>
-        <w:rPr>
-          <w:highlight w:val="yellow"/>
-        </w:rPr>
-        <w:t>tempo</w:t>
-      </w:r>
-      <w:proofErr w:type="gramEnd"/>
-      <w:r>
-        <w:rPr>
-          <w:highlight w:val="yellow"/>
-        </w:rPr>
-        <w:t xml:space="preserve"> mas sentia-se longe de tal possibilidade.</w:t>
+        <w:t>Nesta seção, faça uma autoavaliação pessoal e técnica no decorrer do curso. Traga percepções de sentimentos (empolgação, maturidade, frustrações) com as quais conviveu até chegar neste ponto. Traga também suas percepções com relação a, por exemplo, satisfações ou frustrações de capacidades que alcançou ao longo da sua formação. Por exemplo, qual o primeiro momento em que se sentiu como um profissional capacitado a realizar as atividades esperadas de um egresso do curso, ou quando dedicou tempo mas sentia-se longe de tal possibilidade.</w:t>
       </w:r>
     </w:p>
     <w:p>
@@ -5901,12 +5028,12 @@
           </w14:textFill>
         </w:rPr>
       </w:pPr>
-      <w:bookmarkStart w:id="23" w:name="_Toc222648872"/>
+      <w:bookmarkStart w:id="22" w:name="_Toc222648872"/>
       <w:r>
         <w:lastRenderedPageBreak/>
         <w:t>Referências</w:t>
       </w:r>
-      <w:bookmarkEnd w:id="23"/>
+      <w:bookmarkEnd w:id="22"/>
     </w:p>
     <w:p>
       <w:pPr>
@@ -6021,10 +5148,7 @@
       </w:r>
       <w:proofErr w:type="spellStart"/>
       <w:r>
-        <w:t>ReactJ</w:t>
-      </w:r>
-      <w:r>
-        <w:t>s</w:t>
+        <w:t>ReactJs</w:t>
       </w:r>
       <w:proofErr w:type="spellEnd"/>
       <w:r>
@@ -6096,13 +5220,7 @@
         <w:t xml:space="preserve">Disponível em: </w:t>
       </w:r>
       <w:r>
-        <w:t>&lt;</w:t>
-      </w:r>
-      <w:r>
-        <w:t>https://adamwathan.me/css-utility-classes-and-separation-of-concerns/</w:t>
-      </w:r>
-      <w:r>
-        <w:t>&gt;</w:t>
+        <w:t>&lt;https://adamwathan.me/css-utility-classes-and-separation-of-concerns/&gt;</w:t>
       </w:r>
       <w:r>
         <w:t xml:space="preserve">. Acesso em: </w:t>
@@ -6142,28 +5260,7 @@
       </w:r>
       <w:proofErr w:type="spellEnd"/>
       <w:r>
-        <w:t xml:space="preserve"> </w:t>
-      </w:r>
-      <w:r>
-        <w:t>Node.js. 201</w:t>
-      </w:r>
-      <w:r>
-        <w:t>1</w:t>
-      </w:r>
-      <w:r>
-        <w:t>. Disponível em: &lt;</w:t>
-      </w:r>
-      <w:r>
-        <w:t xml:space="preserve"> </w:t>
-      </w:r>
-      <w:r>
-        <w:t xml:space="preserve">https://www.youtube.com/watch?v=jo_B4LTHi3I&gt;. Acesso em: </w:t>
-      </w:r>
-      <w:r>
-        <w:t>06/02/2026</w:t>
-      </w:r>
-      <w:r>
-        <w:t>.</w:t>
+        <w:t xml:space="preserve"> Node.js. 2011. Disponível em: &lt; https://www.youtube.com/watch?v=jo_B4LTHi3I&gt;. Acesso em: 06/02/2026.</w:t>
       </w:r>
     </w:p>
     <w:p>
@@ -6181,13 +5278,7 @@
         <w:rPr>
           <w:lang w:val="en-US"/>
         </w:rPr>
-        <w:t xml:space="preserve">CANTELON, Mike; </w:t>
-      </w:r>
-      <w:r>
-        <w:rPr>
-          <w:lang w:val="en-US"/>
-        </w:rPr>
-        <w:t>HARTER, Marc; HOLOWAYCHUK, T.J.; RAJLICH, Nathan</w:t>
+        <w:t>CANTELON, Mike; HARTER, Marc; HOLOWAYCHUK, T.J.; RAJLICH, Nathan</w:t>
       </w:r>
       <w:r>
         <w:rPr>
@@ -6251,21 +5342,7 @@
       </w:r>
       <w:proofErr w:type="spellEnd"/>
       <w:r>
-        <w:t>: Banco de dados de documentos para desenvolvimento de apps. [</w:t>
-      </w:r>
-      <w:proofErr w:type="gramStart"/>
-      <w:r>
-        <w:t>s.d.]b.</w:t>
-      </w:r>
-      <w:proofErr w:type="gramEnd"/>
-      <w:r>
-        <w:t xml:space="preserve"> Disponível em: firebase.google.com. Acesso em: </w:t>
-      </w:r>
-      <w:r>
-        <w:t>07/02/2026</w:t>
-      </w:r>
-      <w:r>
-        <w:t>.</w:t>
+        <w:t>: Banco de dados de documentos para desenvolvimento de apps. [s.d.]b. Disponível em: firebase.google.com. Acesso em: 07/02/2026.</w:t>
       </w:r>
     </w:p>
     <w:p>
@@ -6285,13 +5362,7 @@
       </w:r>
       <w:proofErr w:type="spellEnd"/>
       <w:r>
-        <w:t xml:space="preserve">: Plataforma de desenvolvimento de apps. [s.d.]. Disponível em: firebase.google.com. Acesso em: </w:t>
-      </w:r>
-      <w:r>
-        <w:t>07/02/2026</w:t>
-      </w:r>
-      <w:r>
-        <w:t>.</w:t>
+        <w:t>: Plataforma de desenvolvimento de apps. [s.d.]. Disponível em: firebase.google.com. Acesso em: 07/02/2026.</w:t>
       </w:r>
     </w:p>
     <w:p>
@@ -6319,21 +5390,7 @@
       </w:r>
       <w:proofErr w:type="spellEnd"/>
       <w:r>
-        <w:t>. [</w:t>
-      </w:r>
-      <w:proofErr w:type="gramStart"/>
-      <w:r>
-        <w:t>s.d.]a.</w:t>
-      </w:r>
-      <w:proofErr w:type="gramEnd"/>
-      <w:r>
-        <w:t xml:space="preserve"> Disponível em: firebase.google.com. Acesso em: </w:t>
-      </w:r>
-      <w:r>
-        <w:t>07/02/2026</w:t>
-      </w:r>
-      <w:r>
-        <w:t>.</w:t>
+        <w:t>. [s.d.]a. Disponível em: firebase.google.com. Acesso em: 07/02/2026.</w:t>
       </w:r>
     </w:p>
     <w:p>
@@ -6345,22 +5402,7 @@
         </w:numPr>
       </w:pPr>
       <w:r>
-        <w:t>BATTISTI</w:t>
-      </w:r>
-      <w:r>
-        <w:t xml:space="preserve">, </w:t>
-      </w:r>
-      <w:r>
-        <w:t>Matheus</w:t>
-      </w:r>
-      <w:r>
-        <w:t xml:space="preserve">. </w:t>
-      </w:r>
-      <w:r>
-        <w:t>O que é JWT? Aprenda tudo sobre JSON Web Token</w:t>
-      </w:r>
-      <w:r>
-        <w:t>. Disponível em: &lt;https://www.youtube.com/</w:t>
+        <w:t>BATTISTI, Matheus. O que é JWT? Aprenda tudo sobre JSON Web Token. Disponível em: &lt;https://www.youtube.com/</w:t>
       </w:r>
       <w:proofErr w:type="spellStart"/>
       <w:r>
@@ -6376,13 +5418,7 @@
       </w:r>
       <w:proofErr w:type="spellEnd"/>
       <w:r>
-        <w:t>&gt;. Acesso em: 0</w:t>
-      </w:r>
-      <w:r>
-        <w:t>8</w:t>
-      </w:r>
-      <w:r>
-        <w:t>/02/2026.</w:t>
+        <w:t>&gt;. Acesso em: 08/02/2026.</w:t>
       </w:r>
     </w:p>
     <w:p>
@@ -6458,13 +5494,7 @@
       </w:r>
       <w:proofErr w:type="spellEnd"/>
       <w:r>
-        <w:t xml:space="preserve"> GitHub. [s.d.]. Disponível em: github.com. Acesso em: </w:t>
-      </w:r>
-      <w:r>
-        <w:t>12/02/2026</w:t>
-      </w:r>
-      <w:r>
-        <w:t>.</w:t>
+        <w:t xml:space="preserve"> GitHub. [s.d.]. Disponível em: github.com. Acesso em: 12/02/2026.</w:t>
       </w:r>
     </w:p>
     <w:p>
@@ -6479,21 +5509,7 @@
         <w:rPr>
           <w:lang w:val="en-US"/>
         </w:rPr>
-        <w:t xml:space="preserve">DOCKER. What is a </w:t>
-      </w:r>
-      <w:proofErr w:type="gramStart"/>
-      <w:r>
-        <w:rPr>
-          <w:lang w:val="en-US"/>
-        </w:rPr>
-        <w:t>Container?.</w:t>
-      </w:r>
-      <w:proofErr w:type="gramEnd"/>
-      <w:r>
-        <w:rPr>
-          <w:lang w:val="en-US"/>
-        </w:rPr>
-        <w:t xml:space="preserve"> </w:t>
+        <w:t xml:space="preserve">DOCKER. What is a Container?. </w:t>
       </w:r>
       <w:r>
         <w:t xml:space="preserve">[s.d.]. Disponível em: www.docker.com. Acesso em: </w:t>

</xml_diff>